<commit_message>
simulation set up but needs to be validated with more experimental data. I will set up system to run minus chassis and gather some data to feed back into simulation
</commit_message>
<xml_diff>
--- a/Self Balancing Robot Derivations.docx
+++ b/Self Balancing Robot Derivations.docx
@@ -1248,13 +1248,7 @@
             <w:rPr>
               <w:rFonts w:ascii="Cambria Math" w:eastAsiaTheme="minorEastAsia" w:hAnsi="Cambria Math"/>
             </w:rPr>
-            <m:t>x</m:t>
-          </m:r>
-          <m:r>
-            <w:rPr>
-              <w:rFonts w:ascii="Cambria Math" w:eastAsiaTheme="minorEastAsia" w:hAnsi="Cambria Math"/>
-            </w:rPr>
-            <m:t>=current position of cart. Assume pendulum is leaning forward.</m:t>
+            <m:t>x=current position of cart. Assume pendulum is leaning forward.</m:t>
           </m:r>
         </m:oMath>
       </m:oMathPara>
@@ -1541,13 +1535,7 @@
             <w:rPr>
               <w:rFonts w:ascii="Cambria Math" w:hAnsi="Cambria Math"/>
             </w:rPr>
-            <m:t>lcos</m:t>
-          </m:r>
-          <m:r>
-            <w:rPr>
-              <w:rFonts w:ascii="Cambria Math" w:hAnsi="Cambria Math"/>
-            </w:rPr>
-            <m:t>θ</m:t>
+            <m:t>lcosθ</m:t>
           </m:r>
         </m:oMath>
       </m:oMathPara>
@@ -1604,13 +1592,7 @@
             <w:rPr>
               <w:rFonts w:ascii="Cambria Math" w:eastAsiaTheme="minorEastAsia" w:hAnsi="Cambria Math"/>
             </w:rPr>
-            <m:t xml:space="preserve">= </m:t>
-          </m:r>
-          <m:r>
-            <w:rPr>
-              <w:rFonts w:ascii="Cambria Math" w:eastAsiaTheme="minorEastAsia" w:hAnsi="Cambria Math"/>
-            </w:rPr>
-            <m:t>-</m:t>
+            <m:t>= -</m:t>
           </m:r>
           <m:acc>
             <m:accPr>
@@ -1635,19 +1617,7 @@
             <w:rPr>
               <w:rFonts w:ascii="Cambria Math" w:hAnsi="Cambria Math"/>
             </w:rPr>
-            <m:t>l</m:t>
-          </m:r>
-          <m:r>
-            <w:rPr>
-              <w:rFonts w:ascii="Cambria Math" w:hAnsi="Cambria Math"/>
-            </w:rPr>
-            <m:t>sin</m:t>
-          </m:r>
-          <m:r>
-            <w:rPr>
-              <w:rFonts w:ascii="Cambria Math" w:hAnsi="Cambria Math"/>
-            </w:rPr>
-            <m:t>θ</m:t>
+            <m:t>lsinθ</m:t>
           </m:r>
         </m:oMath>
       </m:oMathPara>
@@ -3260,13 +3230,7 @@
                     <w:rPr>
                       <w:rFonts w:ascii="Cambria Math" w:hAnsi="Cambria Math"/>
                     </w:rPr>
-                    <m:t>∂</m:t>
-                  </m:r>
-                  <m:r>
-                    <w:rPr>
-                      <w:rFonts w:ascii="Cambria Math" w:hAnsi="Cambria Math"/>
-                    </w:rPr>
-                    <m:t>L</m:t>
+                    <m:t>∂L</m:t>
                   </m:r>
                 </m:num>
                 <m:den>
@@ -3339,13 +3303,7 @@
                 <w:rPr>
                   <w:rFonts w:ascii="Cambria Math" w:hAnsi="Cambria Math"/>
                 </w:rPr>
-                <m:t>∂</m:t>
-              </m:r>
-              <m:r>
-                <w:rPr>
-                  <w:rFonts w:ascii="Cambria Math" w:hAnsi="Cambria Math"/>
-                </w:rPr>
-                <m:t>L</m:t>
+                <m:t>∂L</m:t>
               </m:r>
             </m:num>
             <m:den>
@@ -3620,13 +3578,7 @@
                   <w:rPr>
                     <w:rFonts w:ascii="Cambria Math" w:hAnsi="Cambria Math"/>
                   </w:rPr>
-                  <m:t>∂</m:t>
-                </m:r>
-                <m:r>
-                  <w:rPr>
-                    <w:rFonts w:ascii="Cambria Math" w:hAnsi="Cambria Math"/>
-                  </w:rPr>
-                  <m:t>L</m:t>
+                  <m:t>∂L</m:t>
                 </m:r>
               </m:num>
               <m:den>
@@ -3663,13 +3615,7 @@
           <w:rPr>
             <w:rFonts w:ascii="Cambria Math" w:eastAsiaTheme="minorEastAsia" w:hAnsi="Cambria Math"/>
           </w:rPr>
-          <m:t>=</m:t>
-        </m:r>
-        <m:r>
-          <w:rPr>
-            <w:rFonts w:ascii="Cambria Math" w:eastAsiaTheme="minorEastAsia" w:hAnsi="Cambria Math"/>
-          </w:rPr>
-          <m:t xml:space="preserve"> </m:t>
+          <m:t xml:space="preserve">= </m:t>
         </m:r>
         <m:f>
           <m:fPr>
@@ -4128,13 +4074,7 @@
                 <w:rPr>
                   <w:rFonts w:ascii="Cambria Math" w:hAnsi="Cambria Math"/>
                 </w:rPr>
-                <m:t>∂</m:t>
-              </m:r>
-              <m:r>
-                <w:rPr>
-                  <w:rFonts w:ascii="Cambria Math" w:hAnsi="Cambria Math"/>
-                </w:rPr>
-                <m:t>L</m:t>
+                <m:t>∂L</m:t>
               </m:r>
             </m:num>
             <m:den>
@@ -4142,13 +4082,7 @@
                 <w:rPr>
                   <w:rFonts w:ascii="Cambria Math" w:hAnsi="Cambria Math"/>
                 </w:rPr>
-                <m:t>∂</m:t>
-              </m:r>
-              <m:r>
-                <w:rPr>
-                  <w:rFonts w:ascii="Cambria Math" w:hAnsi="Cambria Math"/>
-                </w:rPr>
-                <m:t>x</m:t>
+                <m:t>∂x</m:t>
               </m:r>
             </m:den>
           </m:f>
@@ -4648,8 +4582,42 @@
             <w:rPr>
               <w:rFonts w:ascii="Cambria Math" w:eastAsiaTheme="minorEastAsia" w:hAnsi="Cambria Math"/>
             </w:rPr>
-            <m:t xml:space="preserve">= 0 </m:t>
+            <m:t xml:space="preserve">= </m:t>
           </m:r>
+          <m:sSub>
+            <m:sSubPr>
+              <m:ctrlPr>
+                <w:rPr>
+                  <w:rFonts w:ascii="Cambria Math" w:eastAsiaTheme="minorEastAsia" w:hAnsi="Cambria Math"/>
+                  <w:b/>
+                  <w:bCs/>
+                  <w:i/>
+                </w:rPr>
+              </m:ctrlPr>
+            </m:sSubPr>
+            <m:e>
+              <m:r>
+                <m:rPr>
+                  <m:sty m:val="bi"/>
+                </m:rPr>
+                <w:rPr>
+                  <w:rFonts w:ascii="Cambria Math" w:eastAsiaTheme="minorEastAsia" w:hAnsi="Cambria Math"/>
+                </w:rPr>
+                <m:t>τ</m:t>
+              </m:r>
+            </m:e>
+            <m:sub>
+              <m:r>
+                <m:rPr>
+                  <m:sty m:val="bi"/>
+                </m:rPr>
+                <w:rPr>
+                  <w:rFonts w:ascii="Cambria Math" w:eastAsiaTheme="minorEastAsia" w:hAnsi="Cambria Math"/>
+                </w:rPr>
+                <m:t>m</m:t>
+              </m:r>
+            </m:sub>
+          </m:sSub>
         </m:oMath>
       </m:oMathPara>
     </w:p>
@@ -4682,13 +4650,7 @@
                 <w:rPr>
                   <w:rFonts w:ascii="Cambria Math" w:eastAsiaTheme="minorEastAsia" w:hAnsi="Cambria Math"/>
                 </w:rPr>
-                <m:t>=</m:t>
-              </m:r>
-              <m:r>
-                <w:rPr>
-                  <w:rFonts w:ascii="Cambria Math" w:eastAsiaTheme="minorEastAsia" w:hAnsi="Cambria Math"/>
-                </w:rPr>
-                <m:t>d</m:t>
+                <m:t>=d</m:t>
               </m:r>
             </m:e>
             <m:sub>
@@ -4794,13 +4756,7 @@
                   <w:rPr>
                     <w:rFonts w:ascii="Cambria Math" w:hAnsi="Cambria Math"/>
                   </w:rPr>
-                  <m:t>∂</m:t>
-                </m:r>
-                <m:r>
-                  <w:rPr>
-                    <w:rFonts w:ascii="Cambria Math" w:hAnsi="Cambria Math"/>
-                  </w:rPr>
-                  <m:t>L</m:t>
+                  <m:t>∂L</m:t>
                 </m:r>
               </m:num>
               <m:den>
@@ -4837,13 +4793,7 @@
           <w:rPr>
             <w:rFonts w:ascii="Cambria Math" w:eastAsiaTheme="minorEastAsia" w:hAnsi="Cambria Math"/>
           </w:rPr>
-          <m:t>=</m:t>
-        </m:r>
-        <m:r>
-          <w:rPr>
-            <w:rFonts w:ascii="Cambria Math" w:eastAsiaTheme="minorEastAsia" w:hAnsi="Cambria Math"/>
-          </w:rPr>
-          <m:t xml:space="preserve"> </m:t>
+          <m:t xml:space="preserve">= </m:t>
         </m:r>
         <m:f>
           <m:fPr>
@@ -5294,13 +5244,7 @@
                 <w:rPr>
                   <w:rFonts w:ascii="Cambria Math" w:hAnsi="Cambria Math"/>
                 </w:rPr>
-                <m:t>∂</m:t>
-              </m:r>
-              <m:r>
-                <w:rPr>
-                  <w:rFonts w:ascii="Cambria Math" w:hAnsi="Cambria Math"/>
-                </w:rPr>
-                <m:t>L</m:t>
+                <m:t>∂L</m:t>
               </m:r>
             </m:num>
             <m:den>
@@ -5308,13 +5252,7 @@
                 <w:rPr>
                   <w:rFonts w:ascii="Cambria Math" w:hAnsi="Cambria Math"/>
                 </w:rPr>
-                <m:t>∂</m:t>
-              </m:r>
-              <m:r>
-                <w:rPr>
-                  <w:rFonts w:ascii="Cambria Math" w:hAnsi="Cambria Math"/>
-                </w:rPr>
-                <m:t>θ</m:t>
+                <m:t>∂θ</m:t>
               </m:r>
             </m:den>
           </m:f>
@@ -5322,13 +5260,7 @@
             <w:rPr>
               <w:rFonts w:ascii="Cambria Math" w:eastAsiaTheme="minorEastAsia" w:hAnsi="Cambria Math"/>
             </w:rPr>
-            <m:t>=</m:t>
-          </m:r>
-          <m:r>
-            <w:rPr>
-              <w:rFonts w:ascii="Cambria Math" w:eastAsiaTheme="minorEastAsia" w:hAnsi="Cambria Math"/>
-            </w:rPr>
-            <m:t>-</m:t>
+            <m:t>=-</m:t>
           </m:r>
           <m:sSub>
             <m:sSubPr>
@@ -5979,49 +5911,6 @@
             <w:rPr>
               <w:rFonts w:ascii="Cambria Math" w:eastAsiaTheme="minorEastAsia" w:hAnsi="Cambria Math"/>
             </w:rPr>
-            <m:t>-</m:t>
-          </m:r>
-          <m:sSub>
-            <m:sSubPr>
-              <m:ctrlPr>
-                <w:rPr>
-                  <w:rFonts w:ascii="Cambria Math" w:eastAsiaTheme="minorEastAsia" w:hAnsi="Cambria Math"/>
-                  <w:b/>
-                  <w:bCs/>
-                  <w:i/>
-                </w:rPr>
-              </m:ctrlPr>
-            </m:sSubPr>
-            <m:e>
-              <m:r>
-                <m:rPr>
-                  <m:sty m:val="bi"/>
-                </m:rPr>
-                <w:rPr>
-                  <w:rFonts w:ascii="Cambria Math" w:eastAsiaTheme="minorEastAsia" w:hAnsi="Cambria Math"/>
-                </w:rPr>
-                <m:t>τ</m:t>
-              </m:r>
-            </m:e>
-            <m:sub>
-              <m:r>
-                <m:rPr>
-                  <m:sty m:val="bi"/>
-                </m:rPr>
-                <w:rPr>
-                  <w:rFonts w:ascii="Cambria Math" w:eastAsiaTheme="minorEastAsia" w:hAnsi="Cambria Math"/>
-                </w:rPr>
-                <m:t>m</m:t>
-              </m:r>
-            </m:sub>
-          </m:sSub>
-          <m:r>
-            <m:rPr>
-              <m:sty m:val="bi"/>
-            </m:rPr>
-            <w:rPr>
-              <w:rFonts w:ascii="Cambria Math" w:eastAsiaTheme="minorEastAsia" w:hAnsi="Cambria Math"/>
-            </w:rPr>
             <m:t xml:space="preserve"> </m:t>
           </m:r>
         </m:oMath>
@@ -6040,19 +5929,7 @@
             <w:rPr>
               <w:rFonts w:ascii="Cambria Math" w:eastAsiaTheme="minorEastAsia" w:hAnsi="Cambria Math"/>
             </w:rPr>
-            <m:t xml:space="preserve">(assuming no </m:t>
-          </m:r>
-          <m:r>
-            <w:rPr>
-              <w:rFonts w:ascii="Cambria Math" w:eastAsiaTheme="minorEastAsia" w:hAnsi="Cambria Math"/>
-            </w:rPr>
-            <m:t xml:space="preserve">damping </m:t>
-          </m:r>
-          <m:r>
-            <w:rPr>
-              <w:rFonts w:ascii="Cambria Math" w:eastAsiaTheme="minorEastAsia" w:hAnsi="Cambria Math"/>
-            </w:rPr>
-            <m:t xml:space="preserve">friction for now otherwise </m:t>
+            <m:t xml:space="preserve">(assuming no damping friction for now otherwise </m:t>
           </m:r>
           <m:sSub>
             <m:sSubPr>
@@ -7581,6 +7458,3082 @@
         </w:rPr>
         <w:t xml:space="preserve">I’ll prove this out fully if there’s issues on the controls side. </w:t>
       </w:r>
+    </w:p>
+    <w:p>
+      <w:pPr>
+        <w:jc w:val="center"/>
+        <w:rPr>
+          <w:rFonts w:eastAsiaTheme="minorEastAsia"/>
+        </w:rPr>
+      </w:pPr>
+    </w:p>
+    <w:p>
+      <w:pPr>
+        <w:jc w:val="center"/>
+        <w:rPr>
+          <w:rFonts w:eastAsiaTheme="minorEastAsia"/>
+        </w:rPr>
+      </w:pPr>
+    </w:p>
+    <w:p>
+      <w:pPr>
+        <w:jc w:val="center"/>
+        <w:rPr>
+          <w:rFonts w:eastAsiaTheme="minorEastAsia"/>
+        </w:rPr>
+      </w:pPr>
+      <w:r>
+        <w:rPr>
+          <w:rFonts w:eastAsiaTheme="minorEastAsia"/>
+        </w:rPr>
+        <w:t xml:space="preserve">After running the simulation and using ChatGPT a bit, I learned that there were some issues with my </w:t>
+      </w:r>
+      <w:r>
+        <w:rPr>
+          <w:rFonts w:eastAsiaTheme="minorEastAsia"/>
+        </w:rPr>
+        <w:t>state space equation. Here is the corrected form</w:t>
+      </w:r>
+      <w:r>
+        <w:rPr>
+          <w:rFonts w:eastAsiaTheme="minorEastAsia"/>
+        </w:rPr>
+        <w:t xml:space="preserve"> (B and E matrices)</w:t>
+      </w:r>
+      <w:r>
+        <w:rPr>
+          <w:rFonts w:eastAsiaTheme="minorEastAsia"/>
+        </w:rPr>
+        <w:t>:</w:t>
+      </w:r>
+    </w:p>
+    <w:p>
+      <w:pPr>
+        <w:jc w:val="center"/>
+        <w:rPr>
+          <w:rFonts w:eastAsiaTheme="minorEastAsia"/>
+        </w:rPr>
+      </w:pPr>
+    </w:p>
+    <w:p>
+      <w:pPr>
+        <w:jc w:val="center"/>
+        <w:rPr>
+          <w:rFonts w:eastAsiaTheme="minorEastAsia"/>
+        </w:rPr>
+      </w:pPr>
+      <m:oMathPara>
+        <m:oMath>
+          <m:acc>
+            <m:accPr>
+              <m:chr m:val="̇"/>
+              <m:ctrlPr>
+                <w:rPr>
+                  <w:rFonts w:ascii="Cambria Math" w:eastAsiaTheme="minorEastAsia" w:hAnsi="Cambria Math"/>
+                  <w:i/>
+                </w:rPr>
+              </m:ctrlPr>
+            </m:accPr>
+            <m:e>
+              <m:r>
+                <w:rPr>
+                  <w:rFonts w:ascii="Cambria Math" w:eastAsiaTheme="minorEastAsia" w:hAnsi="Cambria Math"/>
+                </w:rPr>
+                <m:t>x</m:t>
+              </m:r>
+            </m:e>
+          </m:acc>
+          <m:r>
+            <w:rPr>
+              <w:rFonts w:ascii="Cambria Math" w:eastAsiaTheme="minorEastAsia" w:hAnsi="Cambria Math"/>
+            </w:rPr>
+            <m:t>=</m:t>
+          </m:r>
+          <m:d>
+            <m:dPr>
+              <m:begChr m:val="["/>
+              <m:endChr m:val="]"/>
+              <m:ctrlPr>
+                <w:rPr>
+                  <w:rFonts w:ascii="Cambria Math" w:eastAsiaTheme="minorEastAsia" w:hAnsi="Cambria Math"/>
+                  <w:i/>
+                </w:rPr>
+              </m:ctrlPr>
+            </m:dPr>
+            <m:e>
+              <m:r>
+                <w:rPr>
+                  <w:rFonts w:ascii="Cambria Math" w:eastAsiaTheme="minorEastAsia" w:hAnsi="Cambria Math"/>
+                </w:rPr>
+                <m:t xml:space="preserve"> </m:t>
+              </m:r>
+              <m:m>
+                <m:mPr>
+                  <m:mcs>
+                    <m:mc>
+                      <m:mcPr>
+                        <m:count m:val="4"/>
+                        <m:mcJc m:val="center"/>
+                      </m:mcPr>
+                    </m:mc>
+                  </m:mcs>
+                  <m:ctrlPr>
+                    <w:rPr>
+                      <w:rFonts w:ascii="Cambria Math" w:eastAsiaTheme="minorEastAsia" w:hAnsi="Cambria Math"/>
+                      <w:i/>
+                    </w:rPr>
+                  </m:ctrlPr>
+                </m:mPr>
+                <m:mr>
+                  <m:e>
+                    <m:r>
+                      <w:rPr>
+                        <w:rFonts w:ascii="Cambria Math" w:eastAsiaTheme="minorEastAsia" w:hAnsi="Cambria Math"/>
+                      </w:rPr>
+                      <m:t>0</m:t>
+                    </m:r>
+                  </m:e>
+                  <m:e>
+                    <m:r>
+                      <w:rPr>
+                        <w:rFonts w:ascii="Cambria Math" w:eastAsiaTheme="minorEastAsia" w:hAnsi="Cambria Math"/>
+                      </w:rPr>
+                      <m:t>1</m:t>
+                    </m:r>
+                  </m:e>
+                  <m:e>
+                    <m:r>
+                      <w:rPr>
+                        <w:rFonts w:ascii="Cambria Math" w:eastAsiaTheme="minorEastAsia" w:hAnsi="Cambria Math"/>
+                      </w:rPr>
+                      <m:t>0</m:t>
+                    </m:r>
+                    <m:ctrlPr>
+                      <w:rPr>
+                        <w:rFonts w:ascii="Cambria Math" w:eastAsia="Cambria Math" w:hAnsi="Cambria Math" w:cs="Cambria Math"/>
+                        <w:i/>
+                      </w:rPr>
+                    </m:ctrlPr>
+                  </m:e>
+                  <m:e>
+                    <m:r>
+                      <w:rPr>
+                        <w:rFonts w:ascii="Cambria Math" w:eastAsia="Cambria Math" w:hAnsi="Cambria Math" w:cs="Cambria Math"/>
+                      </w:rPr>
+                      <m:t>0</m:t>
+                    </m:r>
+                  </m:e>
+                </m:mr>
+                <m:mr>
+                  <m:e>
+                    <m:r>
+                      <w:rPr>
+                        <w:rFonts w:ascii="Cambria Math" w:eastAsiaTheme="minorEastAsia" w:hAnsi="Cambria Math"/>
+                      </w:rPr>
+                      <m:t>0</m:t>
+                    </m:r>
+                  </m:e>
+                  <m:e>
+                    <m:r>
+                      <w:rPr>
+                        <w:rFonts w:ascii="Cambria Math" w:eastAsiaTheme="minorEastAsia" w:hAnsi="Cambria Math"/>
+                      </w:rPr>
+                      <m:t>0</m:t>
+                    </m:r>
+                  </m:e>
+                  <m:e>
+                    <m:f>
+                      <m:fPr>
+                        <m:ctrlPr>
+                          <w:rPr>
+                            <w:rFonts w:ascii="Cambria Math" w:eastAsiaTheme="minorEastAsia" w:hAnsi="Cambria Math"/>
+                            <w:i/>
+                          </w:rPr>
+                        </m:ctrlPr>
+                      </m:fPr>
+                      <m:num>
+                        <m:r>
+                          <w:rPr>
+                            <w:rFonts w:ascii="Cambria Math" w:eastAsiaTheme="minorEastAsia" w:hAnsi="Cambria Math"/>
+                          </w:rPr>
+                          <m:t>-</m:t>
+                        </m:r>
+                        <m:sSup>
+                          <m:sSupPr>
+                            <m:ctrlPr>
+                              <w:rPr>
+                                <w:rFonts w:ascii="Cambria Math" w:eastAsiaTheme="minorEastAsia" w:hAnsi="Cambria Math"/>
+                                <w:i/>
+                              </w:rPr>
+                            </m:ctrlPr>
+                          </m:sSupPr>
+                          <m:e>
+                            <m:sSub>
+                              <m:sSubPr>
+                                <m:ctrlPr>
+                                  <w:rPr>
+                                    <w:rFonts w:ascii="Cambria Math" w:eastAsiaTheme="minorEastAsia" w:hAnsi="Cambria Math"/>
+                                    <w:i/>
+                                  </w:rPr>
+                                </m:ctrlPr>
+                              </m:sSubPr>
+                              <m:e>
+                                <m:r>
+                                  <w:rPr>
+                                    <w:rFonts w:ascii="Cambria Math" w:eastAsiaTheme="minorEastAsia" w:hAnsi="Cambria Math"/>
+                                  </w:rPr>
+                                  <m:t>(m</m:t>
+                                </m:r>
+                              </m:e>
+                              <m:sub>
+                                <m:r>
+                                  <w:rPr>
+                                    <w:rFonts w:ascii="Cambria Math" w:eastAsiaTheme="minorEastAsia" w:hAnsi="Cambria Math"/>
+                                  </w:rPr>
+                                  <m:t>b</m:t>
+                                </m:r>
+                              </m:sub>
+                            </m:sSub>
+                            <m:r>
+                              <w:rPr>
+                                <w:rFonts w:ascii="Cambria Math" w:eastAsiaTheme="minorEastAsia" w:hAnsi="Cambria Math"/>
+                              </w:rPr>
+                              <m:t>l)</m:t>
+                            </m:r>
+                          </m:e>
+                          <m:sup>
+                            <m:r>
+                              <w:rPr>
+                                <w:rFonts w:ascii="Cambria Math" w:eastAsiaTheme="minorEastAsia" w:hAnsi="Cambria Math"/>
+                              </w:rPr>
+                              <m:t>2</m:t>
+                            </m:r>
+                          </m:sup>
+                        </m:sSup>
+                        <m:r>
+                          <w:rPr>
+                            <w:rFonts w:ascii="Cambria Math" w:eastAsiaTheme="minorEastAsia" w:hAnsi="Cambria Math"/>
+                          </w:rPr>
+                          <m:t xml:space="preserve">g </m:t>
+                        </m:r>
+                      </m:num>
+                      <m:den>
+                        <m:r>
+                          <m:rPr>
+                            <m:sty m:val="p"/>
+                          </m:rPr>
+                          <w:rPr>
+                            <w:rFonts w:ascii="Cambria Math" w:eastAsiaTheme="minorEastAsia" w:hAnsi="Cambria Math"/>
+                          </w:rPr>
+                          <m:t>det⁡</m:t>
+                        </m:r>
+                        <m:r>
+                          <w:rPr>
+                            <w:rFonts w:ascii="Cambria Math" w:eastAsiaTheme="minorEastAsia" w:hAnsi="Cambria Math"/>
+                          </w:rPr>
+                          <m:t>(M)</m:t>
+                        </m:r>
+                      </m:den>
+                    </m:f>
+                    <m:ctrlPr>
+                      <w:rPr>
+                        <w:rFonts w:ascii="Cambria Math" w:eastAsia="Cambria Math" w:hAnsi="Cambria Math" w:cs="Cambria Math"/>
+                        <w:i/>
+                      </w:rPr>
+                    </m:ctrlPr>
+                  </m:e>
+                  <m:e>
+                    <m:r>
+                      <w:rPr>
+                        <w:rFonts w:ascii="Cambria Math" w:eastAsia="Cambria Math" w:hAnsi="Cambria Math" w:cs="Cambria Math"/>
+                      </w:rPr>
+                      <m:t>0</m:t>
+                    </m:r>
+                  </m:e>
+                </m:mr>
+                <m:mr>
+                  <m:e>
+                    <m:r>
+                      <w:rPr>
+                        <w:rFonts w:ascii="Cambria Math" w:eastAsiaTheme="minorEastAsia" w:hAnsi="Cambria Math"/>
+                      </w:rPr>
+                      <m:t>0</m:t>
+                    </m:r>
+                    <m:ctrlPr>
+                      <w:rPr>
+                        <w:rFonts w:ascii="Cambria Math" w:eastAsia="Cambria Math" w:hAnsi="Cambria Math" w:cs="Cambria Math"/>
+                        <w:i/>
+                      </w:rPr>
+                    </m:ctrlPr>
+                  </m:e>
+                  <m:e>
+                    <m:r>
+                      <w:rPr>
+                        <w:rFonts w:ascii="Cambria Math" w:eastAsia="Cambria Math" w:hAnsi="Cambria Math" w:cs="Cambria Math"/>
+                      </w:rPr>
+                      <m:t>0</m:t>
+                    </m:r>
+                    <m:ctrlPr>
+                      <w:rPr>
+                        <w:rFonts w:ascii="Cambria Math" w:eastAsia="Cambria Math" w:hAnsi="Cambria Math" w:cs="Cambria Math"/>
+                        <w:i/>
+                      </w:rPr>
+                    </m:ctrlPr>
+                  </m:e>
+                  <m:e>
+                    <m:r>
+                      <w:rPr>
+                        <w:rFonts w:ascii="Cambria Math" w:eastAsia="Cambria Math" w:hAnsi="Cambria Math" w:cs="Cambria Math"/>
+                      </w:rPr>
+                      <m:t>0</m:t>
+                    </m:r>
+                    <m:ctrlPr>
+                      <w:rPr>
+                        <w:rFonts w:ascii="Cambria Math" w:eastAsia="Cambria Math" w:hAnsi="Cambria Math" w:cs="Cambria Math"/>
+                        <w:i/>
+                      </w:rPr>
+                    </m:ctrlPr>
+                  </m:e>
+                  <m:e>
+                    <m:r>
+                      <w:rPr>
+                        <w:rFonts w:ascii="Cambria Math" w:eastAsia="Cambria Math" w:hAnsi="Cambria Math" w:cs="Cambria Math"/>
+                      </w:rPr>
+                      <m:t>1</m:t>
+                    </m:r>
+                    <m:ctrlPr>
+                      <w:rPr>
+                        <w:rFonts w:ascii="Cambria Math" w:eastAsia="Cambria Math" w:hAnsi="Cambria Math" w:cs="Cambria Math"/>
+                        <w:i/>
+                      </w:rPr>
+                    </m:ctrlPr>
+                  </m:e>
+                </m:mr>
+                <m:mr>
+                  <m:e>
+                    <m:r>
+                      <w:rPr>
+                        <w:rFonts w:ascii="Cambria Math" w:eastAsia="Cambria Math" w:hAnsi="Cambria Math" w:cs="Cambria Math"/>
+                      </w:rPr>
+                      <m:t>0</m:t>
+                    </m:r>
+                  </m:e>
+                  <m:e>
+                    <m:r>
+                      <w:rPr>
+                        <w:rFonts w:ascii="Cambria Math" w:eastAsiaTheme="minorEastAsia" w:hAnsi="Cambria Math"/>
+                      </w:rPr>
+                      <m:t>0</m:t>
+                    </m:r>
+                  </m:e>
+                  <m:e>
+                    <m:f>
+                      <m:fPr>
+                        <m:ctrlPr>
+                          <w:rPr>
+                            <w:rFonts w:ascii="Cambria Math" w:eastAsiaTheme="minorEastAsia" w:hAnsi="Cambria Math"/>
+                            <w:i/>
+                          </w:rPr>
+                        </m:ctrlPr>
+                      </m:fPr>
+                      <m:num>
+                        <m:sSub>
+                          <m:sSubPr>
+                            <m:ctrlPr>
+                              <w:rPr>
+                                <w:rFonts w:ascii="Cambria Math" w:eastAsiaTheme="minorEastAsia" w:hAnsi="Cambria Math"/>
+                                <w:i/>
+                              </w:rPr>
+                            </m:ctrlPr>
+                          </m:sSubPr>
+                          <m:e>
+                            <m:r>
+                              <w:rPr>
+                                <w:rFonts w:ascii="Cambria Math" w:eastAsiaTheme="minorEastAsia" w:hAnsi="Cambria Math"/>
+                              </w:rPr>
+                              <m:t>M</m:t>
+                            </m:r>
+                          </m:e>
+                          <m:sub>
+                            <m:r>
+                              <w:rPr>
+                                <w:rFonts w:ascii="Cambria Math" w:eastAsiaTheme="minorEastAsia" w:hAnsi="Cambria Math"/>
+                              </w:rPr>
+                              <m:t>eff</m:t>
+                            </m:r>
+                          </m:sub>
+                        </m:sSub>
+                        <m:sSub>
+                          <m:sSubPr>
+                            <m:ctrlPr>
+                              <w:rPr>
+                                <w:rFonts w:ascii="Cambria Math" w:eastAsiaTheme="minorEastAsia" w:hAnsi="Cambria Math"/>
+                                <w:i/>
+                              </w:rPr>
+                            </m:ctrlPr>
+                          </m:sSubPr>
+                          <m:e>
+                            <m:r>
+                              <w:rPr>
+                                <w:rFonts w:ascii="Cambria Math" w:eastAsiaTheme="minorEastAsia" w:hAnsi="Cambria Math"/>
+                              </w:rPr>
+                              <m:t>m</m:t>
+                            </m:r>
+                          </m:e>
+                          <m:sub>
+                            <m:r>
+                              <w:rPr>
+                                <w:rFonts w:ascii="Cambria Math" w:eastAsiaTheme="minorEastAsia" w:hAnsi="Cambria Math"/>
+                              </w:rPr>
+                              <m:t>b</m:t>
+                            </m:r>
+                          </m:sub>
+                        </m:sSub>
+                        <m:r>
+                          <w:rPr>
+                            <w:rFonts w:ascii="Cambria Math" w:eastAsiaTheme="minorEastAsia" w:hAnsi="Cambria Math"/>
+                          </w:rPr>
+                          <m:t>gl</m:t>
+                        </m:r>
+                      </m:num>
+                      <m:den>
+                        <m:r>
+                          <m:rPr>
+                            <m:sty m:val="p"/>
+                          </m:rPr>
+                          <w:rPr>
+                            <w:rFonts w:ascii="Cambria Math" w:eastAsiaTheme="minorEastAsia" w:hAnsi="Cambria Math"/>
+                          </w:rPr>
+                          <m:t>det⁡</m:t>
+                        </m:r>
+                        <m:r>
+                          <w:rPr>
+                            <w:rFonts w:ascii="Cambria Math" w:eastAsiaTheme="minorEastAsia" w:hAnsi="Cambria Math"/>
+                          </w:rPr>
+                          <m:t>(M)</m:t>
+                        </m:r>
+                      </m:den>
+                    </m:f>
+                    <m:ctrlPr>
+                      <w:rPr>
+                        <w:rFonts w:ascii="Cambria Math" w:eastAsia="Cambria Math" w:hAnsi="Cambria Math" w:cs="Cambria Math"/>
+                        <w:i/>
+                      </w:rPr>
+                    </m:ctrlPr>
+                  </m:e>
+                  <m:e>
+                    <m:r>
+                      <w:rPr>
+                        <w:rFonts w:ascii="Cambria Math" w:eastAsia="Cambria Math" w:hAnsi="Cambria Math" w:cs="Cambria Math"/>
+                      </w:rPr>
+                      <m:t>0</m:t>
+                    </m:r>
+                  </m:e>
+                </m:mr>
+              </m:m>
+            </m:e>
+          </m:d>
+          <m:r>
+            <w:rPr>
+              <w:rFonts w:ascii="Cambria Math" w:eastAsiaTheme="minorEastAsia" w:hAnsi="Cambria Math"/>
+            </w:rPr>
+            <m:t>x+</m:t>
+          </m:r>
+          <m:d>
+            <m:dPr>
+              <m:begChr m:val="["/>
+              <m:endChr m:val="]"/>
+              <m:ctrlPr>
+                <w:rPr>
+                  <w:rFonts w:ascii="Cambria Math" w:eastAsiaTheme="minorEastAsia" w:hAnsi="Cambria Math"/>
+                  <w:i/>
+                </w:rPr>
+              </m:ctrlPr>
+            </m:dPr>
+            <m:e>
+              <m:m>
+                <m:mPr>
+                  <m:mcs>
+                    <m:mc>
+                      <m:mcPr>
+                        <m:count m:val="1"/>
+                        <m:mcJc m:val="center"/>
+                      </m:mcPr>
+                    </m:mc>
+                  </m:mcs>
+                  <m:ctrlPr>
+                    <w:rPr>
+                      <w:rFonts w:ascii="Cambria Math" w:eastAsiaTheme="minorEastAsia" w:hAnsi="Cambria Math"/>
+                      <w:i/>
+                    </w:rPr>
+                  </m:ctrlPr>
+                </m:mPr>
+                <m:mr>
+                  <m:e>
+                    <m:r>
+                      <w:rPr>
+                        <w:rFonts w:ascii="Cambria Math" w:eastAsiaTheme="minorEastAsia" w:hAnsi="Cambria Math"/>
+                      </w:rPr>
+                      <m:t>0</m:t>
+                    </m:r>
+                  </m:e>
+                </m:mr>
+                <m:mr>
+                  <m:e>
+                    <m:f>
+                      <m:fPr>
+                        <m:ctrlPr>
+                          <w:rPr>
+                            <w:rFonts w:ascii="Cambria Math" w:eastAsiaTheme="minorEastAsia" w:hAnsi="Cambria Math"/>
+                            <w:i/>
+                          </w:rPr>
+                        </m:ctrlPr>
+                      </m:fPr>
+                      <m:num>
+                        <m:sSub>
+                          <m:sSubPr>
+                            <m:ctrlPr>
+                              <w:rPr>
+                                <w:rFonts w:ascii="Cambria Math" w:eastAsiaTheme="minorEastAsia" w:hAnsi="Cambria Math"/>
+                                <w:i/>
+                              </w:rPr>
+                            </m:ctrlPr>
+                          </m:sSubPr>
+                          <m:e>
+                            <m:r>
+                              <w:rPr>
+                                <w:rFonts w:ascii="Cambria Math" w:eastAsiaTheme="minorEastAsia" w:hAnsi="Cambria Math"/>
+                              </w:rPr>
+                              <m:t>I</m:t>
+                            </m:r>
+                          </m:e>
+                          <m:sub>
+                            <m:r>
+                              <w:rPr>
+                                <w:rFonts w:ascii="Cambria Math" w:eastAsiaTheme="minorEastAsia" w:hAnsi="Cambria Math"/>
+                              </w:rPr>
+                              <m:t>eff</m:t>
+                            </m:r>
+                          </m:sub>
+                        </m:sSub>
+                      </m:num>
+                      <m:den>
+                        <m:func>
+                          <m:funcPr>
+                            <m:ctrlPr>
+                              <w:rPr>
+                                <w:rFonts w:ascii="Cambria Math" w:eastAsiaTheme="minorEastAsia" w:hAnsi="Cambria Math"/>
+                              </w:rPr>
+                            </m:ctrlPr>
+                          </m:funcPr>
+                          <m:fName>
+                            <m:r>
+                              <m:rPr>
+                                <m:sty m:val="p"/>
+                              </m:rPr>
+                              <w:rPr>
+                                <w:rFonts w:ascii="Cambria Math" w:eastAsiaTheme="minorEastAsia" w:hAnsi="Cambria Math"/>
+                              </w:rPr>
+                              <m:t>det</m:t>
+                            </m:r>
+                          </m:fName>
+                          <m:e>
+                            <m:d>
+                              <m:dPr>
+                                <m:ctrlPr>
+                                  <w:rPr>
+                                    <w:rFonts w:ascii="Cambria Math" w:eastAsiaTheme="minorEastAsia" w:hAnsi="Cambria Math"/>
+                                    <w:i/>
+                                  </w:rPr>
+                                </m:ctrlPr>
+                              </m:dPr>
+                              <m:e>
+                                <m:r>
+                                  <w:rPr>
+                                    <w:rFonts w:ascii="Cambria Math" w:eastAsiaTheme="minorEastAsia" w:hAnsi="Cambria Math"/>
+                                  </w:rPr>
+                                  <m:t>M</m:t>
+                                </m:r>
+                              </m:e>
+                            </m:d>
+                          </m:e>
+                        </m:func>
+                      </m:den>
+                    </m:f>
+                  </m:e>
+                </m:mr>
+                <m:mr>
+                  <m:e>
+                    <m:r>
+                      <w:rPr>
+                        <w:rFonts w:ascii="Cambria Math" w:eastAsiaTheme="minorEastAsia" w:hAnsi="Cambria Math"/>
+                      </w:rPr>
+                      <m:t>0</m:t>
+                    </m:r>
+                    <m:ctrlPr>
+                      <w:rPr>
+                        <w:rFonts w:ascii="Cambria Math" w:eastAsia="Cambria Math" w:hAnsi="Cambria Math" w:cs="Cambria Math"/>
+                        <w:i/>
+                      </w:rPr>
+                    </m:ctrlPr>
+                  </m:e>
+                </m:mr>
+                <m:mr>
+                  <m:e>
+                    <m:f>
+                      <m:fPr>
+                        <m:ctrlPr>
+                          <w:rPr>
+                            <w:rFonts w:ascii="Cambria Math" w:eastAsia="Cambria Math" w:hAnsi="Cambria Math" w:cs="Cambria Math"/>
+                            <w:i/>
+                          </w:rPr>
+                        </m:ctrlPr>
+                      </m:fPr>
+                      <m:num>
+                        <m:r>
+                          <w:rPr>
+                            <w:rFonts w:ascii="Cambria Math" w:eastAsia="Cambria Math" w:hAnsi="Cambria Math" w:cs="Cambria Math"/>
+                          </w:rPr>
+                          <m:t>-</m:t>
+                        </m:r>
+                        <m:sSub>
+                          <m:sSubPr>
+                            <m:ctrlPr>
+                              <w:rPr>
+                                <w:rFonts w:ascii="Cambria Math" w:eastAsia="Cambria Math" w:hAnsi="Cambria Math" w:cs="Cambria Math"/>
+                                <w:i/>
+                              </w:rPr>
+                            </m:ctrlPr>
+                          </m:sSubPr>
+                          <m:e>
+                            <m:r>
+                              <w:rPr>
+                                <w:rFonts w:ascii="Cambria Math" w:eastAsia="Cambria Math" w:hAnsi="Cambria Math" w:cs="Cambria Math"/>
+                              </w:rPr>
+                              <m:t>m</m:t>
+                            </m:r>
+                          </m:e>
+                          <m:sub>
+                            <m:r>
+                              <w:rPr>
+                                <w:rFonts w:ascii="Cambria Math" w:eastAsia="Cambria Math" w:hAnsi="Cambria Math" w:cs="Cambria Math"/>
+                              </w:rPr>
+                              <m:t>b</m:t>
+                            </m:r>
+                          </m:sub>
+                        </m:sSub>
+                        <m:r>
+                          <w:rPr>
+                            <w:rFonts w:ascii="Cambria Math" w:eastAsia="Cambria Math" w:hAnsi="Cambria Math" w:cs="Cambria Math"/>
+                          </w:rPr>
+                          <m:t>l</m:t>
+                        </m:r>
+                      </m:num>
+                      <m:den>
+                        <m:func>
+                          <m:funcPr>
+                            <m:ctrlPr>
+                              <w:rPr>
+                                <w:rFonts w:ascii="Cambria Math" w:eastAsia="Cambria Math" w:hAnsi="Cambria Math" w:cs="Cambria Math"/>
+                              </w:rPr>
+                            </m:ctrlPr>
+                          </m:funcPr>
+                          <m:fName>
+                            <m:r>
+                              <m:rPr>
+                                <m:sty m:val="p"/>
+                              </m:rPr>
+                              <w:rPr>
+                                <w:rFonts w:ascii="Cambria Math" w:eastAsia="Cambria Math" w:hAnsi="Cambria Math" w:cs="Cambria Math"/>
+                              </w:rPr>
+                              <m:t>det</m:t>
+                            </m:r>
+                          </m:fName>
+                          <m:e>
+                            <m:d>
+                              <m:dPr>
+                                <m:ctrlPr>
+                                  <w:rPr>
+                                    <w:rFonts w:ascii="Cambria Math" w:eastAsia="Cambria Math" w:hAnsi="Cambria Math" w:cs="Cambria Math"/>
+                                    <w:i/>
+                                  </w:rPr>
+                                </m:ctrlPr>
+                              </m:dPr>
+                              <m:e>
+                                <m:r>
+                                  <w:rPr>
+                                    <w:rFonts w:ascii="Cambria Math" w:eastAsia="Cambria Math" w:hAnsi="Cambria Math" w:cs="Cambria Math"/>
+                                  </w:rPr>
+                                  <m:t>M</m:t>
+                                </m:r>
+                              </m:e>
+                            </m:d>
+                          </m:e>
+                        </m:func>
+                      </m:den>
+                    </m:f>
+                  </m:e>
+                </m:mr>
+              </m:m>
+            </m:e>
+          </m:d>
+          <m:r>
+            <w:rPr>
+              <w:rFonts w:ascii="Cambria Math" w:eastAsiaTheme="minorEastAsia" w:hAnsi="Cambria Math"/>
+            </w:rPr>
+            <m:t>u+</m:t>
+          </m:r>
+          <m:d>
+            <m:dPr>
+              <m:begChr m:val="["/>
+              <m:endChr m:val="]"/>
+              <m:ctrlPr>
+                <w:rPr>
+                  <w:rFonts w:ascii="Cambria Math" w:eastAsiaTheme="minorEastAsia" w:hAnsi="Cambria Math"/>
+                  <w:i/>
+                </w:rPr>
+              </m:ctrlPr>
+            </m:dPr>
+            <m:e>
+              <m:m>
+                <m:mPr>
+                  <m:mcs>
+                    <m:mc>
+                      <m:mcPr>
+                        <m:count m:val="1"/>
+                        <m:mcJc m:val="center"/>
+                      </m:mcPr>
+                    </m:mc>
+                  </m:mcs>
+                  <m:ctrlPr>
+                    <w:rPr>
+                      <w:rFonts w:ascii="Cambria Math" w:eastAsiaTheme="minorEastAsia" w:hAnsi="Cambria Math"/>
+                      <w:i/>
+                    </w:rPr>
+                  </m:ctrlPr>
+                </m:mPr>
+                <m:mr>
+                  <m:e>
+                    <m:r>
+                      <w:rPr>
+                        <w:rFonts w:ascii="Cambria Math" w:eastAsiaTheme="minorEastAsia" w:hAnsi="Cambria Math"/>
+                      </w:rPr>
+                      <m:t>0</m:t>
+                    </m:r>
+                  </m:e>
+                </m:mr>
+                <m:mr>
+                  <m:e>
+                    <m:f>
+                      <m:fPr>
+                        <m:ctrlPr>
+                          <w:rPr>
+                            <w:rFonts w:ascii="Cambria Math" w:eastAsiaTheme="minorEastAsia" w:hAnsi="Cambria Math"/>
+                            <w:i/>
+                          </w:rPr>
+                        </m:ctrlPr>
+                      </m:fPr>
+                      <m:num>
+                        <m:sSub>
+                          <m:sSubPr>
+                            <m:ctrlPr>
+                              <w:rPr>
+                                <w:rFonts w:ascii="Cambria Math" w:eastAsiaTheme="minorEastAsia" w:hAnsi="Cambria Math"/>
+                                <w:i/>
+                              </w:rPr>
+                            </m:ctrlPr>
+                          </m:sSubPr>
+                          <m:e>
+                            <m:r>
+                              <w:rPr>
+                                <w:rFonts w:ascii="Cambria Math" w:eastAsiaTheme="minorEastAsia" w:hAnsi="Cambria Math"/>
+                              </w:rPr>
+                              <m:t>I</m:t>
+                            </m:r>
+                          </m:e>
+                          <m:sub>
+                            <m:r>
+                              <w:rPr>
+                                <w:rFonts w:ascii="Cambria Math" w:eastAsiaTheme="minorEastAsia" w:hAnsi="Cambria Math"/>
+                              </w:rPr>
+                              <m:t>eff</m:t>
+                            </m:r>
+                          </m:sub>
+                        </m:sSub>
+                      </m:num>
+                      <m:den>
+                        <m:func>
+                          <m:funcPr>
+                            <m:ctrlPr>
+                              <w:rPr>
+                                <w:rFonts w:ascii="Cambria Math" w:eastAsiaTheme="minorEastAsia" w:hAnsi="Cambria Math"/>
+                              </w:rPr>
+                            </m:ctrlPr>
+                          </m:funcPr>
+                          <m:fName>
+                            <m:r>
+                              <m:rPr>
+                                <m:sty m:val="p"/>
+                              </m:rPr>
+                              <w:rPr>
+                                <w:rFonts w:ascii="Cambria Math" w:eastAsiaTheme="minorEastAsia" w:hAnsi="Cambria Math"/>
+                              </w:rPr>
+                              <m:t>det</m:t>
+                            </m:r>
+                          </m:fName>
+                          <m:e>
+                            <m:d>
+                              <m:dPr>
+                                <m:ctrlPr>
+                                  <w:rPr>
+                                    <w:rFonts w:ascii="Cambria Math" w:eastAsiaTheme="minorEastAsia" w:hAnsi="Cambria Math"/>
+                                    <w:i/>
+                                  </w:rPr>
+                                </m:ctrlPr>
+                              </m:dPr>
+                              <m:e>
+                                <m:r>
+                                  <w:rPr>
+                                    <w:rFonts w:ascii="Cambria Math" w:eastAsiaTheme="minorEastAsia" w:hAnsi="Cambria Math"/>
+                                  </w:rPr>
+                                  <m:t>M</m:t>
+                                </m:r>
+                              </m:e>
+                            </m:d>
+                          </m:e>
+                        </m:func>
+                      </m:den>
+                    </m:f>
+                    <m:ctrlPr>
+                      <w:rPr>
+                        <w:rFonts w:ascii="Cambria Math" w:eastAsia="Cambria Math" w:hAnsi="Cambria Math" w:cs="Cambria Math"/>
+                        <w:i/>
+                      </w:rPr>
+                    </m:ctrlPr>
+                  </m:e>
+                </m:mr>
+                <m:mr>
+                  <m:e>
+                    <m:r>
+                      <w:rPr>
+                        <w:rFonts w:ascii="Cambria Math" w:eastAsia="Cambria Math" w:hAnsi="Cambria Math" w:cs="Cambria Math"/>
+                      </w:rPr>
+                      <m:t>0</m:t>
+                    </m:r>
+                  </m:e>
+                </m:mr>
+                <m:mr>
+                  <m:e>
+                    <m:f>
+                      <m:fPr>
+                        <m:ctrlPr>
+                          <w:rPr>
+                            <w:rFonts w:ascii="Cambria Math" w:eastAsia="Cambria Math" w:hAnsi="Cambria Math" w:cs="Cambria Math"/>
+                            <w:i/>
+                          </w:rPr>
+                        </m:ctrlPr>
+                      </m:fPr>
+                      <m:num>
+                        <m:r>
+                          <w:rPr>
+                            <w:rFonts w:ascii="Cambria Math" w:eastAsia="Cambria Math" w:hAnsi="Cambria Math" w:cs="Cambria Math"/>
+                          </w:rPr>
+                          <m:t>-</m:t>
+                        </m:r>
+                        <m:sSub>
+                          <m:sSubPr>
+                            <m:ctrlPr>
+                              <w:rPr>
+                                <w:rFonts w:ascii="Cambria Math" w:eastAsia="Cambria Math" w:hAnsi="Cambria Math" w:cs="Cambria Math"/>
+                                <w:i/>
+                              </w:rPr>
+                            </m:ctrlPr>
+                          </m:sSubPr>
+                          <m:e>
+                            <m:r>
+                              <w:rPr>
+                                <w:rFonts w:ascii="Cambria Math" w:eastAsia="Cambria Math" w:hAnsi="Cambria Math" w:cs="Cambria Math"/>
+                              </w:rPr>
+                              <m:t>m</m:t>
+                            </m:r>
+                          </m:e>
+                          <m:sub>
+                            <m:r>
+                              <w:rPr>
+                                <w:rFonts w:ascii="Cambria Math" w:eastAsia="Cambria Math" w:hAnsi="Cambria Math" w:cs="Cambria Math"/>
+                              </w:rPr>
+                              <m:t>b</m:t>
+                            </m:r>
+                          </m:sub>
+                        </m:sSub>
+                        <m:r>
+                          <w:rPr>
+                            <w:rFonts w:ascii="Cambria Math" w:eastAsia="Cambria Math" w:hAnsi="Cambria Math" w:cs="Cambria Math"/>
+                          </w:rPr>
+                          <m:t>l</m:t>
+                        </m:r>
+                      </m:num>
+                      <m:den>
+                        <m:func>
+                          <m:funcPr>
+                            <m:ctrlPr>
+                              <w:rPr>
+                                <w:rFonts w:ascii="Cambria Math" w:eastAsia="Cambria Math" w:hAnsi="Cambria Math" w:cs="Cambria Math"/>
+                              </w:rPr>
+                            </m:ctrlPr>
+                          </m:funcPr>
+                          <m:fName>
+                            <m:r>
+                              <m:rPr>
+                                <m:sty m:val="p"/>
+                              </m:rPr>
+                              <w:rPr>
+                                <w:rFonts w:ascii="Cambria Math" w:eastAsia="Cambria Math" w:hAnsi="Cambria Math" w:cs="Cambria Math"/>
+                              </w:rPr>
+                              <m:t>det</m:t>
+                            </m:r>
+                          </m:fName>
+                          <m:e>
+                            <m:d>
+                              <m:dPr>
+                                <m:ctrlPr>
+                                  <w:rPr>
+                                    <w:rFonts w:ascii="Cambria Math" w:eastAsia="Cambria Math" w:hAnsi="Cambria Math" w:cs="Cambria Math"/>
+                                    <w:i/>
+                                  </w:rPr>
+                                </m:ctrlPr>
+                              </m:dPr>
+                              <m:e>
+                                <m:r>
+                                  <w:rPr>
+                                    <w:rFonts w:ascii="Cambria Math" w:eastAsia="Cambria Math" w:hAnsi="Cambria Math" w:cs="Cambria Math"/>
+                                  </w:rPr>
+                                  <m:t>M</m:t>
+                                </m:r>
+                              </m:e>
+                            </m:d>
+                          </m:e>
+                        </m:func>
+                      </m:den>
+                    </m:f>
+                  </m:e>
+                </m:mr>
+              </m:m>
+            </m:e>
+          </m:d>
+          <m:r>
+            <w:rPr>
+              <w:rFonts w:ascii="Cambria Math" w:eastAsiaTheme="minorEastAsia" w:hAnsi="Cambria Math"/>
+            </w:rPr>
+            <m:t>d</m:t>
+          </m:r>
+        </m:oMath>
+      </m:oMathPara>
+    </w:p>
+    <w:p>
+      <w:pPr>
+        <w:jc w:val="center"/>
+        <w:rPr>
+          <w:rFonts w:eastAsiaTheme="minorEastAsia"/>
+        </w:rPr>
+      </w:pPr>
+    </w:p>
+    <w:p>
+      <w:pPr>
+        <w:jc w:val="center"/>
+        <w:rPr>
+          <w:rFonts w:eastAsiaTheme="minorEastAsia"/>
+        </w:rPr>
+      </w:pPr>
+    </w:p>
+    <w:p>
+      <w:pPr>
+        <w:jc w:val="center"/>
+        <w:rPr>
+          <w:rFonts w:eastAsiaTheme="minorEastAsia"/>
+        </w:rPr>
+      </w:pPr>
+      <w:r>
+        <w:rPr>
+          <w:rFonts w:eastAsiaTheme="minorEastAsia"/>
+        </w:rPr>
+        <w:t>Understanding the nonlinear dynamics:</w:t>
+      </w:r>
+    </w:p>
+    <w:p>
+      <w:pPr>
+        <w:jc w:val="center"/>
+        <w:rPr>
+          <w:rFonts w:eastAsiaTheme="minorEastAsia"/>
+        </w:rPr>
+      </w:pPr>
+    </w:p>
+    <w:p>
+      <w:pPr>
+        <w:jc w:val="center"/>
+        <w:rPr>
+          <w:rFonts w:eastAsiaTheme="minorEastAsia"/>
+        </w:rPr>
+      </w:pPr>
+      <w:r>
+        <w:rPr>
+          <w:rFonts w:eastAsiaTheme="minorEastAsia"/>
+        </w:rPr>
+        <w:t xml:space="preserve">Robot Manipulator Equation: </w:t>
+      </w:r>
+    </w:p>
+    <w:p>
+      <w:pPr>
+        <w:jc w:val="center"/>
+        <w:rPr>
+          <w:rFonts w:eastAsiaTheme="minorEastAsia"/>
+        </w:rPr>
+      </w:pPr>
+    </w:p>
+    <w:p>
+      <w:pPr>
+        <w:jc w:val="center"/>
+        <w:rPr>
+          <w:rFonts w:eastAsiaTheme="minorEastAsia"/>
+        </w:rPr>
+      </w:pPr>
+      <m:oMathPara>
+        <m:oMath>
+          <m:r>
+            <w:rPr>
+              <w:rFonts w:ascii="Cambria Math" w:eastAsiaTheme="minorEastAsia" w:hAnsi="Cambria Math"/>
+            </w:rPr>
+            <m:t>M</m:t>
+          </m:r>
+          <m:d>
+            <m:dPr>
+              <m:ctrlPr>
+                <w:rPr>
+                  <w:rFonts w:ascii="Cambria Math" w:eastAsiaTheme="minorEastAsia" w:hAnsi="Cambria Math"/>
+                  <w:i/>
+                </w:rPr>
+              </m:ctrlPr>
+            </m:dPr>
+            <m:e>
+              <m:r>
+                <w:rPr>
+                  <w:rFonts w:ascii="Cambria Math" w:eastAsiaTheme="minorEastAsia" w:hAnsi="Cambria Math"/>
+                </w:rPr>
+                <m:t>q</m:t>
+              </m:r>
+            </m:e>
+          </m:d>
+          <m:acc>
+            <m:accPr>
+              <m:chr m:val="̈"/>
+              <m:ctrlPr>
+                <w:rPr>
+                  <w:rFonts w:ascii="Cambria Math" w:eastAsiaTheme="minorEastAsia" w:hAnsi="Cambria Math"/>
+                  <w:i/>
+                </w:rPr>
+              </m:ctrlPr>
+            </m:accPr>
+            <m:e>
+              <m:r>
+                <w:rPr>
+                  <w:rFonts w:ascii="Cambria Math" w:eastAsiaTheme="minorEastAsia" w:hAnsi="Cambria Math"/>
+                </w:rPr>
+                <m:t>q</m:t>
+              </m:r>
+            </m:e>
+          </m:acc>
+          <m:r>
+            <w:rPr>
+              <w:rFonts w:ascii="Cambria Math" w:eastAsiaTheme="minorEastAsia" w:hAnsi="Cambria Math"/>
+            </w:rPr>
+            <m:t>+C</m:t>
+          </m:r>
+          <m:d>
+            <m:dPr>
+              <m:ctrlPr>
+                <w:rPr>
+                  <w:rFonts w:ascii="Cambria Math" w:eastAsiaTheme="minorEastAsia" w:hAnsi="Cambria Math"/>
+                  <w:i/>
+                </w:rPr>
+              </m:ctrlPr>
+            </m:dPr>
+            <m:e>
+              <m:r>
+                <w:rPr>
+                  <w:rFonts w:ascii="Cambria Math" w:eastAsiaTheme="minorEastAsia" w:hAnsi="Cambria Math"/>
+                </w:rPr>
+                <m:t>q,</m:t>
+              </m:r>
+              <m:acc>
+                <m:accPr>
+                  <m:chr m:val="̇"/>
+                  <m:ctrlPr>
+                    <w:rPr>
+                      <w:rFonts w:ascii="Cambria Math" w:eastAsiaTheme="minorEastAsia" w:hAnsi="Cambria Math"/>
+                      <w:i/>
+                    </w:rPr>
+                  </m:ctrlPr>
+                </m:accPr>
+                <m:e>
+                  <m:r>
+                    <w:rPr>
+                      <w:rFonts w:ascii="Cambria Math" w:eastAsiaTheme="minorEastAsia" w:hAnsi="Cambria Math"/>
+                    </w:rPr>
+                    <m:t>q</m:t>
+                  </m:r>
+                </m:e>
+              </m:acc>
+            </m:e>
+          </m:d>
+          <m:acc>
+            <m:accPr>
+              <m:chr m:val="̇"/>
+              <m:ctrlPr>
+                <w:rPr>
+                  <w:rFonts w:ascii="Cambria Math" w:eastAsiaTheme="minorEastAsia" w:hAnsi="Cambria Math"/>
+                  <w:i/>
+                </w:rPr>
+              </m:ctrlPr>
+            </m:accPr>
+            <m:e>
+              <m:r>
+                <w:rPr>
+                  <w:rFonts w:ascii="Cambria Math" w:eastAsiaTheme="minorEastAsia" w:hAnsi="Cambria Math"/>
+                </w:rPr>
+                <m:t>q</m:t>
+              </m:r>
+            </m:e>
+          </m:acc>
+          <m:r>
+            <w:rPr>
+              <w:rFonts w:ascii="Cambria Math" w:eastAsiaTheme="minorEastAsia" w:hAnsi="Cambria Math"/>
+            </w:rPr>
+            <m:t>+G</m:t>
+          </m:r>
+          <m:d>
+            <m:dPr>
+              <m:ctrlPr>
+                <w:rPr>
+                  <w:rFonts w:ascii="Cambria Math" w:eastAsiaTheme="minorEastAsia" w:hAnsi="Cambria Math"/>
+                  <w:i/>
+                </w:rPr>
+              </m:ctrlPr>
+            </m:dPr>
+            <m:e>
+              <m:r>
+                <w:rPr>
+                  <w:rFonts w:ascii="Cambria Math" w:eastAsiaTheme="minorEastAsia" w:hAnsi="Cambria Math"/>
+                </w:rPr>
+                <m:t>q</m:t>
+              </m:r>
+            </m:e>
+          </m:d>
+          <m:r>
+            <w:rPr>
+              <w:rFonts w:ascii="Cambria Math" w:eastAsiaTheme="minorEastAsia" w:hAnsi="Cambria Math"/>
+            </w:rPr>
+            <m:t>=Bu</m:t>
+          </m:r>
+        </m:oMath>
+      </m:oMathPara>
+    </w:p>
+    <w:p>
+      <w:pPr>
+        <w:jc w:val="center"/>
+        <w:rPr>
+          <w:rFonts w:eastAsiaTheme="minorEastAsia"/>
+        </w:rPr>
+      </w:pPr>
+    </w:p>
+    <w:p>
+      <w:pPr>
+        <w:jc w:val="center"/>
+        <w:rPr>
+          <w:rFonts w:eastAsiaTheme="minorEastAsia"/>
+        </w:rPr>
+      </w:pPr>
+      <w:r>
+        <w:rPr>
+          <w:rFonts w:eastAsiaTheme="minorEastAsia"/>
+        </w:rPr>
+        <w:t xml:space="preserve">In a simple sense this regroups the </w:t>
+      </w:r>
+      <w:proofErr w:type="spellStart"/>
+      <w:r>
+        <w:rPr>
+          <w:rFonts w:eastAsiaTheme="minorEastAsia"/>
+        </w:rPr>
+        <w:t>Lagrangian</w:t>
+      </w:r>
+      <w:proofErr w:type="spellEnd"/>
+      <w:r>
+        <w:rPr>
+          <w:rFonts w:eastAsiaTheme="minorEastAsia"/>
+        </w:rPr>
+        <w:t xml:space="preserve"> equations from above into a format that says: this is how much input torque you need from the motor to counteract the mass of the robot (M), the centripetal/</w:t>
+      </w:r>
+      <w:proofErr w:type="spellStart"/>
+      <w:r>
+        <w:rPr>
+          <w:rFonts w:eastAsiaTheme="minorEastAsia"/>
+        </w:rPr>
+        <w:t>coreolis</w:t>
+      </w:r>
+      <w:proofErr w:type="spellEnd"/>
+      <w:r>
+        <w:rPr>
+          <w:rFonts w:eastAsiaTheme="minorEastAsia"/>
+        </w:rPr>
+        <w:t xml:space="preserve"> effect (added force felt when robot swings related to angular velocity) and gravity. </w:t>
+      </w:r>
+    </w:p>
+    <w:p>
+      <w:pPr>
+        <w:jc w:val="center"/>
+        <w:rPr>
+          <w:rFonts w:eastAsiaTheme="minorEastAsia"/>
+        </w:rPr>
+      </w:pPr>
+    </w:p>
+    <w:p>
+      <w:pPr>
+        <w:jc w:val="center"/>
+        <w:rPr>
+          <w:rFonts w:eastAsiaTheme="minorEastAsia"/>
+        </w:rPr>
+      </w:pPr>
+      <w:r>
+        <w:rPr>
+          <w:rFonts w:eastAsiaTheme="minorEastAsia"/>
+        </w:rPr>
+        <w:t xml:space="preserve">Taking out disturbance, these are my </w:t>
+      </w:r>
+      <w:proofErr w:type="spellStart"/>
+      <w:r>
+        <w:rPr>
+          <w:rFonts w:eastAsiaTheme="minorEastAsia"/>
+        </w:rPr>
+        <w:t>Lagrangian</w:t>
+      </w:r>
+      <w:proofErr w:type="spellEnd"/>
+      <w:r>
+        <w:rPr>
+          <w:rFonts w:eastAsiaTheme="minorEastAsia"/>
+        </w:rPr>
+        <w:t xml:space="preserve"> equations as derived above:</w:t>
+      </w:r>
+    </w:p>
+    <w:p>
+      <w:pPr>
+        <w:jc w:val="center"/>
+        <w:rPr>
+          <w:rFonts w:eastAsiaTheme="minorEastAsia"/>
+        </w:rPr>
+      </w:pPr>
+    </w:p>
+    <w:p>
+      <w:pPr>
+        <w:jc w:val="center"/>
+        <w:rPr>
+          <w:rFonts w:eastAsiaTheme="minorEastAsia"/>
+          <w:b/>
+          <w:bCs/>
+        </w:rPr>
+      </w:pPr>
+      <m:oMathPara>
+        <m:oMath>
+          <m:f>
+            <m:fPr>
+              <m:ctrlPr>
+                <w:rPr>
+                  <w:rFonts w:ascii="Cambria Math" w:eastAsiaTheme="minorEastAsia" w:hAnsi="Cambria Math"/>
+                  <w:b/>
+                  <w:bCs/>
+                  <w:i/>
+                </w:rPr>
+              </m:ctrlPr>
+            </m:fPr>
+            <m:num>
+              <m:r>
+                <m:rPr>
+                  <m:sty m:val="bi"/>
+                </m:rPr>
+                <w:rPr>
+                  <w:rFonts w:ascii="Cambria Math" w:eastAsiaTheme="minorEastAsia" w:hAnsi="Cambria Math"/>
+                </w:rPr>
+                <m:t>d</m:t>
+              </m:r>
+            </m:num>
+            <m:den>
+              <m:r>
+                <m:rPr>
+                  <m:sty m:val="bi"/>
+                </m:rPr>
+                <w:rPr>
+                  <w:rFonts w:ascii="Cambria Math" w:eastAsiaTheme="minorEastAsia" w:hAnsi="Cambria Math"/>
+                </w:rPr>
+                <m:t>dt</m:t>
+              </m:r>
+            </m:den>
+          </m:f>
+          <m:d>
+            <m:dPr>
+              <m:ctrlPr>
+                <w:rPr>
+                  <w:rFonts w:ascii="Cambria Math" w:eastAsiaTheme="minorEastAsia" w:hAnsi="Cambria Math"/>
+                  <w:b/>
+                  <w:bCs/>
+                  <w:i/>
+                </w:rPr>
+              </m:ctrlPr>
+            </m:dPr>
+            <m:e>
+              <m:f>
+                <m:fPr>
+                  <m:ctrlPr>
+                    <w:rPr>
+                      <w:rFonts w:ascii="Cambria Math" w:eastAsiaTheme="minorEastAsia" w:hAnsi="Cambria Math"/>
+                      <w:b/>
+                      <w:bCs/>
+                      <w:i/>
+                    </w:rPr>
+                  </m:ctrlPr>
+                </m:fPr>
+                <m:num>
+                  <m:r>
+                    <m:rPr>
+                      <m:sty m:val="bi"/>
+                    </m:rPr>
+                    <w:rPr>
+                      <w:rFonts w:ascii="Cambria Math" w:hAnsi="Cambria Math"/>
+                    </w:rPr>
+                    <m:t>∂L</m:t>
+                  </m:r>
+                </m:num>
+                <m:den>
+                  <m:r>
+                    <m:rPr>
+                      <m:sty m:val="bi"/>
+                    </m:rPr>
+                    <w:rPr>
+                      <w:rFonts w:ascii="Cambria Math" w:hAnsi="Cambria Math"/>
+                    </w:rPr>
+                    <m:t>∂</m:t>
+                  </m:r>
+                  <m:acc>
+                    <m:accPr>
+                      <m:chr m:val="̇"/>
+                      <m:ctrlPr>
+                        <w:rPr>
+                          <w:rFonts w:ascii="Cambria Math" w:hAnsi="Cambria Math"/>
+                          <w:b/>
+                          <w:bCs/>
+                          <w:i/>
+                        </w:rPr>
+                      </m:ctrlPr>
+                    </m:accPr>
+                    <m:e>
+                      <m:r>
+                        <m:rPr>
+                          <m:sty m:val="bi"/>
+                        </m:rPr>
+                        <w:rPr>
+                          <w:rFonts w:ascii="Cambria Math" w:hAnsi="Cambria Math"/>
+                        </w:rPr>
+                        <m:t>x</m:t>
+                      </m:r>
+                    </m:e>
+                  </m:acc>
+                </m:den>
+              </m:f>
+            </m:e>
+          </m:d>
+          <m:r>
+            <m:rPr>
+              <m:sty m:val="bi"/>
+            </m:rPr>
+            <w:rPr>
+              <w:rFonts w:ascii="Cambria Math" w:eastAsiaTheme="minorEastAsia" w:hAnsi="Cambria Math"/>
+            </w:rPr>
+            <m:t xml:space="preserve">- </m:t>
+          </m:r>
+          <m:f>
+            <m:fPr>
+              <m:ctrlPr>
+                <w:rPr>
+                  <w:rFonts w:ascii="Cambria Math" w:eastAsiaTheme="minorEastAsia" w:hAnsi="Cambria Math"/>
+                  <w:b/>
+                  <w:bCs/>
+                  <w:i/>
+                </w:rPr>
+              </m:ctrlPr>
+            </m:fPr>
+            <m:num>
+              <m:r>
+                <m:rPr>
+                  <m:sty m:val="bi"/>
+                </m:rPr>
+                <w:rPr>
+                  <w:rFonts w:ascii="Cambria Math" w:hAnsi="Cambria Math"/>
+                </w:rPr>
+                <m:t>∂L</m:t>
+              </m:r>
+            </m:num>
+            <m:den>
+              <m:r>
+                <m:rPr>
+                  <m:sty m:val="bi"/>
+                </m:rPr>
+                <w:rPr>
+                  <w:rFonts w:ascii="Cambria Math" w:hAnsi="Cambria Math"/>
+                </w:rPr>
+                <m:t>∂x</m:t>
+              </m:r>
+            </m:den>
+          </m:f>
+          <m:r>
+            <m:rPr>
+              <m:sty m:val="bi"/>
+            </m:rPr>
+            <w:rPr>
+              <w:rFonts w:ascii="Cambria Math" w:eastAsiaTheme="minorEastAsia" w:hAnsi="Cambria Math"/>
+            </w:rPr>
+            <m:t xml:space="preserve"> = </m:t>
+          </m:r>
+          <m:acc>
+            <m:accPr>
+              <m:chr m:val="̈"/>
+              <m:ctrlPr>
+                <w:rPr>
+                  <w:rFonts w:ascii="Cambria Math" w:eastAsiaTheme="minorEastAsia" w:hAnsi="Cambria Math"/>
+                  <w:b/>
+                  <w:bCs/>
+                  <w:i/>
+                </w:rPr>
+              </m:ctrlPr>
+            </m:accPr>
+            <m:e>
+              <m:r>
+                <m:rPr>
+                  <m:sty m:val="bi"/>
+                </m:rPr>
+                <w:rPr>
+                  <w:rFonts w:ascii="Cambria Math" w:eastAsiaTheme="minorEastAsia" w:hAnsi="Cambria Math"/>
+                </w:rPr>
+                <m:t>x</m:t>
+              </m:r>
+            </m:e>
+          </m:acc>
+          <m:sSub>
+            <m:sSubPr>
+              <m:ctrlPr>
+                <w:rPr>
+                  <w:rFonts w:ascii="Cambria Math" w:eastAsiaTheme="minorEastAsia" w:hAnsi="Cambria Math"/>
+                  <w:b/>
+                  <w:bCs/>
+                  <w:i/>
+                </w:rPr>
+              </m:ctrlPr>
+            </m:sSubPr>
+            <m:e>
+              <m:r>
+                <m:rPr>
+                  <m:sty m:val="bi"/>
+                </m:rPr>
+                <w:rPr>
+                  <w:rFonts w:ascii="Cambria Math" w:eastAsiaTheme="minorEastAsia" w:hAnsi="Cambria Math"/>
+                </w:rPr>
+                <m:t>M</m:t>
+              </m:r>
+            </m:e>
+            <m:sub>
+              <m:r>
+                <m:rPr>
+                  <m:sty m:val="bi"/>
+                </m:rPr>
+                <w:rPr>
+                  <w:rFonts w:ascii="Cambria Math" w:eastAsiaTheme="minorEastAsia" w:hAnsi="Cambria Math"/>
+                </w:rPr>
+                <m:t>eff</m:t>
+              </m:r>
+            </m:sub>
+          </m:sSub>
+          <m:r>
+            <m:rPr>
+              <m:sty m:val="bi"/>
+            </m:rPr>
+            <w:rPr>
+              <w:rFonts w:ascii="Cambria Math" w:eastAsiaTheme="minorEastAsia" w:hAnsi="Cambria Math"/>
+            </w:rPr>
+            <m:t xml:space="preserve">+ </m:t>
+          </m:r>
+          <m:sSub>
+            <m:sSubPr>
+              <m:ctrlPr>
+                <w:rPr>
+                  <w:rFonts w:ascii="Cambria Math" w:eastAsiaTheme="minorEastAsia" w:hAnsi="Cambria Math"/>
+                  <w:b/>
+                  <w:bCs/>
+                  <w:i/>
+                </w:rPr>
+              </m:ctrlPr>
+            </m:sSubPr>
+            <m:e>
+              <m:r>
+                <m:rPr>
+                  <m:sty m:val="bi"/>
+                </m:rPr>
+                <w:rPr>
+                  <w:rFonts w:ascii="Cambria Math" w:eastAsiaTheme="minorEastAsia" w:hAnsi="Cambria Math"/>
+                </w:rPr>
+                <m:t>m</m:t>
+              </m:r>
+            </m:e>
+            <m:sub>
+              <m:r>
+                <m:rPr>
+                  <m:sty m:val="bi"/>
+                </m:rPr>
+                <w:rPr>
+                  <w:rFonts w:ascii="Cambria Math" w:eastAsiaTheme="minorEastAsia" w:hAnsi="Cambria Math"/>
+                </w:rPr>
+                <m:t>b</m:t>
+              </m:r>
+            </m:sub>
+          </m:sSub>
+          <m:r>
+            <m:rPr>
+              <m:sty m:val="bi"/>
+            </m:rPr>
+            <w:rPr>
+              <w:rFonts w:ascii="Cambria Math" w:eastAsiaTheme="minorEastAsia" w:hAnsi="Cambria Math"/>
+            </w:rPr>
+            <m:t>l</m:t>
+          </m:r>
+          <m:func>
+            <m:funcPr>
+              <m:ctrlPr>
+                <w:rPr>
+                  <w:rFonts w:ascii="Cambria Math" w:eastAsiaTheme="minorEastAsia" w:hAnsi="Cambria Math"/>
+                  <w:b/>
+                  <w:bCs/>
+                  <w:i/>
+                </w:rPr>
+              </m:ctrlPr>
+            </m:funcPr>
+            <m:fName>
+              <m:r>
+                <m:rPr>
+                  <m:sty m:val="b"/>
+                </m:rPr>
+                <w:rPr>
+                  <w:rFonts w:ascii="Cambria Math" w:hAnsi="Cambria Math"/>
+                </w:rPr>
+                <m:t>cos</m:t>
+              </m:r>
+            </m:fName>
+            <m:e>
+              <m:r>
+                <m:rPr>
+                  <m:sty m:val="bi"/>
+                </m:rPr>
+                <w:rPr>
+                  <w:rFonts w:ascii="Cambria Math" w:eastAsiaTheme="minorEastAsia" w:hAnsi="Cambria Math"/>
+                </w:rPr>
+                <m:t>θ</m:t>
+              </m:r>
+            </m:e>
+          </m:func>
+          <m:acc>
+            <m:accPr>
+              <m:chr m:val="̈"/>
+              <m:ctrlPr>
+                <w:rPr>
+                  <w:rFonts w:ascii="Cambria Math" w:eastAsiaTheme="minorEastAsia" w:hAnsi="Cambria Math"/>
+                  <w:b/>
+                  <w:bCs/>
+                  <w:i/>
+                </w:rPr>
+              </m:ctrlPr>
+            </m:accPr>
+            <m:e>
+              <m:r>
+                <m:rPr>
+                  <m:sty m:val="bi"/>
+                </m:rPr>
+                <w:rPr>
+                  <w:rFonts w:ascii="Cambria Math" w:eastAsiaTheme="minorEastAsia" w:hAnsi="Cambria Math"/>
+                </w:rPr>
+                <m:t>θ</m:t>
+              </m:r>
+            </m:e>
+          </m:acc>
+          <m:r>
+            <m:rPr>
+              <m:sty m:val="bi"/>
+            </m:rPr>
+            <w:rPr>
+              <w:rFonts w:ascii="Cambria Math" w:eastAsiaTheme="minorEastAsia" w:hAnsi="Cambria Math"/>
+            </w:rPr>
+            <m:t>-</m:t>
+          </m:r>
+          <m:sSub>
+            <m:sSubPr>
+              <m:ctrlPr>
+                <w:rPr>
+                  <w:rFonts w:ascii="Cambria Math" w:eastAsiaTheme="minorEastAsia" w:hAnsi="Cambria Math"/>
+                  <w:b/>
+                  <w:bCs/>
+                  <w:i/>
+                </w:rPr>
+              </m:ctrlPr>
+            </m:sSubPr>
+            <m:e>
+              <m:r>
+                <m:rPr>
+                  <m:sty m:val="bi"/>
+                </m:rPr>
+                <w:rPr>
+                  <w:rFonts w:ascii="Cambria Math" w:eastAsiaTheme="minorEastAsia" w:hAnsi="Cambria Math"/>
+                </w:rPr>
+                <m:t>m</m:t>
+              </m:r>
+            </m:e>
+            <m:sub>
+              <m:r>
+                <m:rPr>
+                  <m:sty m:val="bi"/>
+                </m:rPr>
+                <w:rPr>
+                  <w:rFonts w:ascii="Cambria Math" w:eastAsiaTheme="minorEastAsia" w:hAnsi="Cambria Math"/>
+                </w:rPr>
+                <m:t>b</m:t>
+              </m:r>
+            </m:sub>
+          </m:sSub>
+          <m:r>
+            <m:rPr>
+              <m:sty m:val="bi"/>
+            </m:rPr>
+            <w:rPr>
+              <w:rFonts w:ascii="Cambria Math" w:eastAsiaTheme="minorEastAsia" w:hAnsi="Cambria Math"/>
+            </w:rPr>
+            <m:t>l</m:t>
+          </m:r>
+          <m:func>
+            <m:funcPr>
+              <m:ctrlPr>
+                <w:rPr>
+                  <w:rFonts w:ascii="Cambria Math" w:eastAsiaTheme="minorEastAsia" w:hAnsi="Cambria Math"/>
+                  <w:b/>
+                  <w:bCs/>
+                  <w:i/>
+                </w:rPr>
+              </m:ctrlPr>
+            </m:funcPr>
+            <m:fName>
+              <m:r>
+                <m:rPr>
+                  <m:sty m:val="b"/>
+                </m:rPr>
+                <w:rPr>
+                  <w:rFonts w:ascii="Cambria Math" w:hAnsi="Cambria Math"/>
+                </w:rPr>
+                <m:t>sin</m:t>
+              </m:r>
+            </m:fName>
+            <m:e>
+              <m:r>
+                <m:rPr>
+                  <m:sty m:val="bi"/>
+                </m:rPr>
+                <w:rPr>
+                  <w:rFonts w:ascii="Cambria Math" w:eastAsiaTheme="minorEastAsia" w:hAnsi="Cambria Math"/>
+                </w:rPr>
+                <m:t>θ</m:t>
+              </m:r>
+            </m:e>
+          </m:func>
+          <m:sSup>
+            <m:sSupPr>
+              <m:ctrlPr>
+                <w:rPr>
+                  <w:rFonts w:ascii="Cambria Math" w:eastAsiaTheme="minorEastAsia" w:hAnsi="Cambria Math"/>
+                  <w:b/>
+                  <w:bCs/>
+                  <w:i/>
+                </w:rPr>
+              </m:ctrlPr>
+            </m:sSupPr>
+            <m:e>
+              <m:acc>
+                <m:accPr>
+                  <m:chr m:val="̇"/>
+                  <m:ctrlPr>
+                    <w:rPr>
+                      <w:rFonts w:ascii="Cambria Math" w:eastAsiaTheme="minorEastAsia" w:hAnsi="Cambria Math"/>
+                      <w:b/>
+                      <w:bCs/>
+                      <w:i/>
+                    </w:rPr>
+                  </m:ctrlPr>
+                </m:accPr>
+                <m:e>
+                  <m:r>
+                    <m:rPr>
+                      <m:sty m:val="bi"/>
+                    </m:rPr>
+                    <w:rPr>
+                      <w:rFonts w:ascii="Cambria Math" w:eastAsiaTheme="minorEastAsia" w:hAnsi="Cambria Math"/>
+                    </w:rPr>
+                    <m:t>θ</m:t>
+                  </m:r>
+                </m:e>
+              </m:acc>
+            </m:e>
+            <m:sup>
+              <m:r>
+                <m:rPr>
+                  <m:sty m:val="bi"/>
+                </m:rPr>
+                <w:rPr>
+                  <w:rFonts w:ascii="Cambria Math" w:eastAsiaTheme="minorEastAsia" w:hAnsi="Cambria Math"/>
+                </w:rPr>
+                <m:t>2</m:t>
+              </m:r>
+            </m:sup>
+          </m:sSup>
+          <m:r>
+            <m:rPr>
+              <m:sty m:val="bi"/>
+            </m:rPr>
+            <w:rPr>
+              <w:rFonts w:ascii="Cambria Math" w:eastAsiaTheme="minorEastAsia" w:hAnsi="Cambria Math"/>
+            </w:rPr>
+            <m:t xml:space="preserve">= </m:t>
+          </m:r>
+          <m:sSub>
+            <m:sSubPr>
+              <m:ctrlPr>
+                <w:rPr>
+                  <w:rFonts w:ascii="Cambria Math" w:eastAsiaTheme="minorEastAsia" w:hAnsi="Cambria Math"/>
+                  <w:b/>
+                  <w:bCs/>
+                  <w:i/>
+                </w:rPr>
+              </m:ctrlPr>
+            </m:sSubPr>
+            <m:e>
+              <m:r>
+                <m:rPr>
+                  <m:sty m:val="bi"/>
+                </m:rPr>
+                <w:rPr>
+                  <w:rFonts w:ascii="Cambria Math" w:eastAsiaTheme="minorEastAsia" w:hAnsi="Cambria Math"/>
+                </w:rPr>
+                <m:t>τ</m:t>
+              </m:r>
+            </m:e>
+            <m:sub>
+              <m:r>
+                <m:rPr>
+                  <m:sty m:val="bi"/>
+                </m:rPr>
+                <w:rPr>
+                  <w:rFonts w:ascii="Cambria Math" w:eastAsiaTheme="minorEastAsia" w:hAnsi="Cambria Math"/>
+                </w:rPr>
+                <m:t>m</m:t>
+              </m:r>
+            </m:sub>
+          </m:sSub>
+        </m:oMath>
+      </m:oMathPara>
+    </w:p>
+    <w:p>
+      <w:pPr>
+        <w:jc w:val="center"/>
+        <w:rPr>
+          <w:rFonts w:eastAsiaTheme="minorEastAsia"/>
+          <w:b/>
+          <w:bCs/>
+        </w:rPr>
+      </w:pPr>
+      <m:oMathPara>
+        <m:oMath>
+          <m:f>
+            <m:fPr>
+              <m:ctrlPr>
+                <w:rPr>
+                  <w:rFonts w:ascii="Cambria Math" w:eastAsiaTheme="minorEastAsia" w:hAnsi="Cambria Math"/>
+                  <w:b/>
+                  <w:bCs/>
+                  <w:i/>
+                </w:rPr>
+              </m:ctrlPr>
+            </m:fPr>
+            <m:num>
+              <m:r>
+                <m:rPr>
+                  <m:sty m:val="bi"/>
+                </m:rPr>
+                <w:rPr>
+                  <w:rFonts w:ascii="Cambria Math" w:eastAsiaTheme="minorEastAsia" w:hAnsi="Cambria Math"/>
+                </w:rPr>
+                <m:t>d</m:t>
+              </m:r>
+            </m:num>
+            <m:den>
+              <m:r>
+                <m:rPr>
+                  <m:sty m:val="bi"/>
+                </m:rPr>
+                <w:rPr>
+                  <w:rFonts w:ascii="Cambria Math" w:eastAsiaTheme="minorEastAsia" w:hAnsi="Cambria Math"/>
+                </w:rPr>
+                <m:t>dt</m:t>
+              </m:r>
+            </m:den>
+          </m:f>
+          <m:d>
+            <m:dPr>
+              <m:ctrlPr>
+                <w:rPr>
+                  <w:rFonts w:ascii="Cambria Math" w:eastAsiaTheme="minorEastAsia" w:hAnsi="Cambria Math"/>
+                  <w:b/>
+                  <w:bCs/>
+                  <w:i/>
+                </w:rPr>
+              </m:ctrlPr>
+            </m:dPr>
+            <m:e>
+              <m:f>
+                <m:fPr>
+                  <m:ctrlPr>
+                    <w:rPr>
+                      <w:rFonts w:ascii="Cambria Math" w:eastAsiaTheme="minorEastAsia" w:hAnsi="Cambria Math"/>
+                      <w:b/>
+                      <w:bCs/>
+                      <w:i/>
+                    </w:rPr>
+                  </m:ctrlPr>
+                </m:fPr>
+                <m:num>
+                  <m:r>
+                    <m:rPr>
+                      <m:sty m:val="bi"/>
+                    </m:rPr>
+                    <w:rPr>
+                      <w:rFonts w:ascii="Cambria Math" w:hAnsi="Cambria Math"/>
+                    </w:rPr>
+                    <m:t>∂L</m:t>
+                  </m:r>
+                </m:num>
+                <m:den>
+                  <m:r>
+                    <m:rPr>
+                      <m:sty m:val="bi"/>
+                    </m:rPr>
+                    <w:rPr>
+                      <w:rFonts w:ascii="Cambria Math" w:hAnsi="Cambria Math"/>
+                    </w:rPr>
+                    <m:t>∂</m:t>
+                  </m:r>
+                  <m:acc>
+                    <m:accPr>
+                      <m:chr m:val="̇"/>
+                      <m:ctrlPr>
+                        <w:rPr>
+                          <w:rFonts w:ascii="Cambria Math" w:hAnsi="Cambria Math"/>
+                          <w:b/>
+                          <w:bCs/>
+                          <w:i/>
+                        </w:rPr>
+                      </m:ctrlPr>
+                    </m:accPr>
+                    <m:e>
+                      <m:r>
+                        <m:rPr>
+                          <m:sty m:val="bi"/>
+                        </m:rPr>
+                        <w:rPr>
+                          <w:rFonts w:ascii="Cambria Math" w:hAnsi="Cambria Math"/>
+                        </w:rPr>
+                        <m:t>θ</m:t>
+                      </m:r>
+                    </m:e>
+                  </m:acc>
+                </m:den>
+              </m:f>
+            </m:e>
+          </m:d>
+          <m:r>
+            <m:rPr>
+              <m:sty m:val="bi"/>
+            </m:rPr>
+            <w:rPr>
+              <w:rFonts w:ascii="Cambria Math" w:eastAsiaTheme="minorEastAsia" w:hAnsi="Cambria Math"/>
+            </w:rPr>
+            <m:t>-</m:t>
+          </m:r>
+          <m:f>
+            <m:fPr>
+              <m:ctrlPr>
+                <w:rPr>
+                  <w:rFonts w:ascii="Cambria Math" w:eastAsiaTheme="minorEastAsia" w:hAnsi="Cambria Math"/>
+                  <w:b/>
+                  <w:bCs/>
+                  <w:i/>
+                </w:rPr>
+              </m:ctrlPr>
+            </m:fPr>
+            <m:num>
+              <m:r>
+                <m:rPr>
+                  <m:sty m:val="bi"/>
+                </m:rPr>
+                <w:rPr>
+                  <w:rFonts w:ascii="Cambria Math" w:hAnsi="Cambria Math"/>
+                </w:rPr>
+                <m:t>∂L</m:t>
+              </m:r>
+            </m:num>
+            <m:den>
+              <m:r>
+                <m:rPr>
+                  <m:sty m:val="bi"/>
+                </m:rPr>
+                <w:rPr>
+                  <w:rFonts w:ascii="Cambria Math" w:hAnsi="Cambria Math"/>
+                </w:rPr>
+                <m:t>∂θ</m:t>
+              </m:r>
+            </m:den>
+          </m:f>
+          <m:r>
+            <m:rPr>
+              <m:sty m:val="bi"/>
+            </m:rPr>
+            <w:rPr>
+              <w:rFonts w:ascii="Cambria Math" w:eastAsiaTheme="minorEastAsia" w:hAnsi="Cambria Math"/>
+            </w:rPr>
+            <m:t xml:space="preserve">= </m:t>
+          </m:r>
+          <m:acc>
+            <m:accPr>
+              <m:chr m:val="̈"/>
+              <m:ctrlPr>
+                <w:rPr>
+                  <w:rFonts w:ascii="Cambria Math" w:eastAsiaTheme="minorEastAsia" w:hAnsi="Cambria Math"/>
+                  <w:b/>
+                  <w:bCs/>
+                  <w:i/>
+                </w:rPr>
+              </m:ctrlPr>
+            </m:accPr>
+            <m:e>
+              <m:r>
+                <m:rPr>
+                  <m:sty m:val="bi"/>
+                </m:rPr>
+                <w:rPr>
+                  <w:rFonts w:ascii="Cambria Math" w:eastAsiaTheme="minorEastAsia" w:hAnsi="Cambria Math"/>
+                </w:rPr>
+                <m:t>θ</m:t>
+              </m:r>
+            </m:e>
+          </m:acc>
+          <m:sSub>
+            <m:sSubPr>
+              <m:ctrlPr>
+                <w:rPr>
+                  <w:rFonts w:ascii="Cambria Math" w:eastAsiaTheme="minorEastAsia" w:hAnsi="Cambria Math"/>
+                  <w:b/>
+                  <w:bCs/>
+                  <w:i/>
+                </w:rPr>
+              </m:ctrlPr>
+            </m:sSubPr>
+            <m:e>
+              <m:r>
+                <m:rPr>
+                  <m:sty m:val="bi"/>
+                </m:rPr>
+                <w:rPr>
+                  <w:rFonts w:ascii="Cambria Math" w:eastAsiaTheme="minorEastAsia" w:hAnsi="Cambria Math"/>
+                </w:rPr>
+                <m:t>I</m:t>
+              </m:r>
+            </m:e>
+            <m:sub>
+              <m:r>
+                <m:rPr>
+                  <m:sty m:val="bi"/>
+                </m:rPr>
+                <w:rPr>
+                  <w:rFonts w:ascii="Cambria Math" w:eastAsiaTheme="minorEastAsia" w:hAnsi="Cambria Math"/>
+                </w:rPr>
+                <m:t>eff</m:t>
+              </m:r>
+            </m:sub>
+          </m:sSub>
+          <m:r>
+            <m:rPr>
+              <m:sty m:val="bi"/>
+            </m:rPr>
+            <w:rPr>
+              <w:rFonts w:ascii="Cambria Math" w:eastAsiaTheme="minorEastAsia" w:hAnsi="Cambria Math"/>
+            </w:rPr>
+            <m:t>+</m:t>
+          </m:r>
+          <m:sSub>
+            <m:sSubPr>
+              <m:ctrlPr>
+                <w:rPr>
+                  <w:rFonts w:ascii="Cambria Math" w:eastAsiaTheme="minorEastAsia" w:hAnsi="Cambria Math"/>
+                  <w:b/>
+                  <w:bCs/>
+                  <w:i/>
+                </w:rPr>
+              </m:ctrlPr>
+            </m:sSubPr>
+            <m:e>
+              <m:r>
+                <m:rPr>
+                  <m:sty m:val="bi"/>
+                </m:rPr>
+                <w:rPr>
+                  <w:rFonts w:ascii="Cambria Math" w:eastAsiaTheme="minorEastAsia" w:hAnsi="Cambria Math"/>
+                </w:rPr>
+                <m:t>m</m:t>
+              </m:r>
+            </m:e>
+            <m:sub>
+              <m:r>
+                <m:rPr>
+                  <m:sty m:val="bi"/>
+                </m:rPr>
+                <w:rPr>
+                  <w:rFonts w:ascii="Cambria Math" w:eastAsiaTheme="minorEastAsia" w:hAnsi="Cambria Math"/>
+                </w:rPr>
+                <m:t>b</m:t>
+              </m:r>
+            </m:sub>
+          </m:sSub>
+          <m:r>
+            <m:rPr>
+              <m:sty m:val="bi"/>
+            </m:rPr>
+            <w:rPr>
+              <w:rFonts w:ascii="Cambria Math" w:eastAsiaTheme="minorEastAsia" w:hAnsi="Cambria Math"/>
+            </w:rPr>
+            <m:t>l</m:t>
+          </m:r>
+          <m:func>
+            <m:funcPr>
+              <m:ctrlPr>
+                <w:rPr>
+                  <w:rFonts w:ascii="Cambria Math" w:eastAsiaTheme="minorEastAsia" w:hAnsi="Cambria Math"/>
+                  <w:b/>
+                  <w:bCs/>
+                  <w:i/>
+                </w:rPr>
+              </m:ctrlPr>
+            </m:funcPr>
+            <m:fName>
+              <m:r>
+                <m:rPr>
+                  <m:sty m:val="b"/>
+                </m:rPr>
+                <w:rPr>
+                  <w:rFonts w:ascii="Cambria Math" w:hAnsi="Cambria Math"/>
+                </w:rPr>
+                <m:t>cos</m:t>
+              </m:r>
+            </m:fName>
+            <m:e>
+              <m:r>
+                <m:rPr>
+                  <m:sty m:val="bi"/>
+                </m:rPr>
+                <w:rPr>
+                  <w:rFonts w:ascii="Cambria Math" w:eastAsiaTheme="minorEastAsia" w:hAnsi="Cambria Math"/>
+                </w:rPr>
+                <m:t>θ</m:t>
+              </m:r>
+            </m:e>
+          </m:func>
+          <m:acc>
+            <m:accPr>
+              <m:chr m:val="̈"/>
+              <m:ctrlPr>
+                <w:rPr>
+                  <w:rFonts w:ascii="Cambria Math" w:eastAsiaTheme="minorEastAsia" w:hAnsi="Cambria Math"/>
+                  <w:b/>
+                  <w:bCs/>
+                  <w:i/>
+                </w:rPr>
+              </m:ctrlPr>
+            </m:accPr>
+            <m:e>
+              <m:r>
+                <m:rPr>
+                  <m:sty m:val="bi"/>
+                </m:rPr>
+                <w:rPr>
+                  <w:rFonts w:ascii="Cambria Math" w:eastAsiaTheme="minorEastAsia" w:hAnsi="Cambria Math"/>
+                </w:rPr>
+                <m:t>x</m:t>
+              </m:r>
+            </m:e>
+          </m:acc>
+          <m:r>
+            <m:rPr>
+              <m:sty m:val="bi"/>
+            </m:rPr>
+            <w:rPr>
+              <w:rFonts w:ascii="Cambria Math" w:eastAsiaTheme="minorEastAsia" w:hAnsi="Cambria Math"/>
+            </w:rPr>
+            <m:t>-</m:t>
+          </m:r>
+          <m:sSub>
+            <m:sSubPr>
+              <m:ctrlPr>
+                <w:rPr>
+                  <w:rFonts w:ascii="Cambria Math" w:eastAsiaTheme="minorEastAsia" w:hAnsi="Cambria Math"/>
+                  <w:b/>
+                  <w:bCs/>
+                  <w:i/>
+                </w:rPr>
+              </m:ctrlPr>
+            </m:sSubPr>
+            <m:e>
+              <m:r>
+                <m:rPr>
+                  <m:sty m:val="bi"/>
+                </m:rPr>
+                <w:rPr>
+                  <w:rFonts w:ascii="Cambria Math" w:eastAsiaTheme="minorEastAsia" w:hAnsi="Cambria Math"/>
+                </w:rPr>
+                <m:t>m</m:t>
+              </m:r>
+            </m:e>
+            <m:sub>
+              <m:r>
+                <m:rPr>
+                  <m:sty m:val="bi"/>
+                </m:rPr>
+                <w:rPr>
+                  <w:rFonts w:ascii="Cambria Math" w:eastAsiaTheme="minorEastAsia" w:hAnsi="Cambria Math"/>
+                </w:rPr>
+                <m:t>b</m:t>
+              </m:r>
+            </m:sub>
+          </m:sSub>
+          <m:r>
+            <m:rPr>
+              <m:sty m:val="bi"/>
+            </m:rPr>
+            <w:rPr>
+              <w:rFonts w:ascii="Cambria Math" w:eastAsiaTheme="minorEastAsia" w:hAnsi="Cambria Math"/>
+            </w:rPr>
+            <m:t>gl</m:t>
+          </m:r>
+          <m:func>
+            <m:funcPr>
+              <m:ctrlPr>
+                <w:rPr>
+                  <w:rFonts w:ascii="Cambria Math" w:eastAsiaTheme="minorEastAsia" w:hAnsi="Cambria Math"/>
+                  <w:b/>
+                  <w:bCs/>
+                  <w:i/>
+                </w:rPr>
+              </m:ctrlPr>
+            </m:funcPr>
+            <m:fName>
+              <m:r>
+                <m:rPr>
+                  <m:sty m:val="b"/>
+                </m:rPr>
+                <w:rPr>
+                  <w:rFonts w:ascii="Cambria Math" w:hAnsi="Cambria Math"/>
+                </w:rPr>
+                <m:t>sin</m:t>
+              </m:r>
+            </m:fName>
+            <m:e>
+              <m:r>
+                <m:rPr>
+                  <m:sty m:val="bi"/>
+                </m:rPr>
+                <w:rPr>
+                  <w:rFonts w:ascii="Cambria Math" w:eastAsiaTheme="minorEastAsia" w:hAnsi="Cambria Math"/>
+                </w:rPr>
+                <m:t>θ</m:t>
+              </m:r>
+            </m:e>
+          </m:func>
+          <m:r>
+            <m:rPr>
+              <m:sty m:val="bi"/>
+            </m:rPr>
+            <w:rPr>
+              <w:rFonts w:ascii="Cambria Math" w:eastAsiaTheme="minorEastAsia" w:hAnsi="Cambria Math"/>
+            </w:rPr>
+            <m:t xml:space="preserve">= </m:t>
+          </m:r>
+          <m:r>
+            <m:rPr>
+              <m:sty m:val="bi"/>
+            </m:rPr>
+            <w:rPr>
+              <w:rFonts w:ascii="Cambria Math" w:eastAsiaTheme="minorEastAsia" w:hAnsi="Cambria Math"/>
+            </w:rPr>
+            <m:t>0</m:t>
+          </m:r>
+          <m:r>
+            <m:rPr>
+              <m:sty m:val="bi"/>
+            </m:rPr>
+            <w:rPr>
+              <w:rFonts w:ascii="Cambria Math" w:eastAsiaTheme="minorEastAsia" w:hAnsi="Cambria Math"/>
+            </w:rPr>
+            <m:t xml:space="preserve"> </m:t>
+          </m:r>
+        </m:oMath>
+      </m:oMathPara>
+    </w:p>
+    <w:p>
+      <w:pPr>
+        <w:jc w:val="center"/>
+        <w:rPr>
+          <w:rFonts w:eastAsiaTheme="minorEastAsia"/>
+        </w:rPr>
+      </w:pPr>
+    </w:p>
+    <w:p>
+      <w:pPr>
+        <w:jc w:val="center"/>
+        <w:rPr>
+          <w:rFonts w:eastAsiaTheme="minorEastAsia"/>
+        </w:rPr>
+      </w:pPr>
+    </w:p>
+    <w:p>
+      <w:pPr>
+        <w:jc w:val="center"/>
+        <w:rPr>
+          <w:rFonts w:eastAsiaTheme="minorEastAsia"/>
+        </w:rPr>
+      </w:pPr>
+      <w:r>
+        <w:rPr>
+          <w:rFonts w:eastAsiaTheme="minorEastAsia"/>
+        </w:rPr>
+        <w:t xml:space="preserve">Based on the manipulator equation all terms related to the double dot (acceleration) are in the M matrix, single dot (velocity) is </w:t>
+      </w:r>
+      <w:proofErr w:type="gramStart"/>
+      <w:r>
+        <w:rPr>
+          <w:rFonts w:eastAsiaTheme="minorEastAsia"/>
+        </w:rPr>
+        <w:t>C</w:t>
+      </w:r>
+      <w:proofErr w:type="gramEnd"/>
+      <w:r>
+        <w:rPr>
+          <w:rFonts w:eastAsiaTheme="minorEastAsia"/>
+        </w:rPr>
+        <w:t xml:space="preserve"> and the g terms go in the G matrix. </w:t>
+      </w:r>
+    </w:p>
+    <w:p>
+      <w:pPr>
+        <w:jc w:val="center"/>
+        <w:rPr>
+          <w:rFonts w:eastAsiaTheme="minorEastAsia"/>
+        </w:rPr>
+      </w:pPr>
+    </w:p>
+    <w:p>
+      <w:pPr>
+        <w:jc w:val="center"/>
+        <w:rPr>
+          <w:rFonts w:eastAsiaTheme="minorEastAsia"/>
+        </w:rPr>
+      </w:pPr>
+      <w:proofErr w:type="gramStart"/>
+      <w:r>
+        <w:rPr>
+          <w:rFonts w:eastAsiaTheme="minorEastAsia"/>
+        </w:rPr>
+        <w:t>So</w:t>
+      </w:r>
+      <w:proofErr w:type="gramEnd"/>
+      <w:r>
+        <w:rPr>
+          <w:rFonts w:eastAsiaTheme="minorEastAsia"/>
+        </w:rPr>
+        <w:t xml:space="preserve"> with </w:t>
+      </w:r>
+      <m:oMath>
+        <m:r>
+          <w:rPr>
+            <w:rFonts w:ascii="Cambria Math" w:eastAsiaTheme="minorEastAsia" w:hAnsi="Cambria Math"/>
+          </w:rPr>
+          <m:t>q=</m:t>
+        </m:r>
+        <m:d>
+          <m:dPr>
+            <m:begChr m:val="["/>
+            <m:endChr m:val="]"/>
+            <m:ctrlPr>
+              <w:rPr>
+                <w:rFonts w:ascii="Cambria Math" w:eastAsiaTheme="minorEastAsia" w:hAnsi="Cambria Math"/>
+                <w:i/>
+              </w:rPr>
+            </m:ctrlPr>
+          </m:dPr>
+          <m:e>
+            <m:m>
+              <m:mPr>
+                <m:mcs>
+                  <m:mc>
+                    <m:mcPr>
+                      <m:count m:val="1"/>
+                      <m:mcJc m:val="center"/>
+                    </m:mcPr>
+                  </m:mc>
+                </m:mcs>
+                <m:ctrlPr>
+                  <w:rPr>
+                    <w:rFonts w:ascii="Cambria Math" w:eastAsiaTheme="minorEastAsia" w:hAnsi="Cambria Math"/>
+                    <w:i/>
+                  </w:rPr>
+                </m:ctrlPr>
+              </m:mPr>
+              <m:mr>
+                <m:e>
+                  <m:r>
+                    <w:rPr>
+                      <w:rFonts w:ascii="Cambria Math" w:eastAsiaTheme="minorEastAsia" w:hAnsi="Cambria Math"/>
+                    </w:rPr>
+                    <m:t>x</m:t>
+                  </m:r>
+                </m:e>
+              </m:mr>
+              <m:mr>
+                <m:e>
+                  <m:r>
+                    <w:rPr>
+                      <w:rFonts w:ascii="Cambria Math" w:eastAsiaTheme="minorEastAsia" w:hAnsi="Cambria Math"/>
+                    </w:rPr>
+                    <m:t>θ</m:t>
+                  </m:r>
+                </m:e>
+              </m:mr>
+            </m:m>
+          </m:e>
+        </m:d>
+      </m:oMath>
+    </w:p>
+    <w:p>
+      <w:pPr>
+        <w:jc w:val="center"/>
+        <w:rPr>
+          <w:rFonts w:eastAsiaTheme="minorEastAsia"/>
+        </w:rPr>
+      </w:pPr>
+    </w:p>
+    <w:p>
+      <w:pPr>
+        <w:jc w:val="center"/>
+        <w:rPr>
+          <w:rFonts w:eastAsiaTheme="minorEastAsia"/>
+        </w:rPr>
+      </w:pPr>
+    </w:p>
+    <w:p>
+      <w:pPr>
+        <w:jc w:val="center"/>
+        <w:rPr>
+          <w:rFonts w:eastAsiaTheme="minorEastAsia"/>
+        </w:rPr>
+      </w:pPr>
+      <m:oMathPara>
+        <m:oMath>
+          <m:r>
+            <w:rPr>
+              <w:rFonts w:ascii="Cambria Math" w:eastAsiaTheme="minorEastAsia" w:hAnsi="Cambria Math"/>
+            </w:rPr>
+            <m:t xml:space="preserve">M= </m:t>
+          </m:r>
+          <m:d>
+            <m:dPr>
+              <m:begChr m:val="["/>
+              <m:endChr m:val="]"/>
+              <m:ctrlPr>
+                <w:rPr>
+                  <w:rFonts w:ascii="Cambria Math" w:eastAsiaTheme="minorEastAsia" w:hAnsi="Cambria Math"/>
+                  <w:i/>
+                </w:rPr>
+              </m:ctrlPr>
+            </m:dPr>
+            <m:e>
+              <m:m>
+                <m:mPr>
+                  <m:mcs>
+                    <m:mc>
+                      <m:mcPr>
+                        <m:count m:val="2"/>
+                        <m:mcJc m:val="center"/>
+                      </m:mcPr>
+                    </m:mc>
+                  </m:mcs>
+                  <m:ctrlPr>
+                    <w:rPr>
+                      <w:rFonts w:ascii="Cambria Math" w:eastAsiaTheme="minorEastAsia" w:hAnsi="Cambria Math"/>
+                      <w:i/>
+                    </w:rPr>
+                  </m:ctrlPr>
+                </m:mPr>
+                <m:mr>
+                  <m:e>
+                    <m:sSub>
+                      <m:sSubPr>
+                        <m:ctrlPr>
+                          <w:rPr>
+                            <w:rFonts w:ascii="Cambria Math" w:eastAsiaTheme="minorEastAsia" w:hAnsi="Cambria Math"/>
+                            <w:i/>
+                          </w:rPr>
+                        </m:ctrlPr>
+                      </m:sSubPr>
+                      <m:e>
+                        <m:r>
+                          <w:rPr>
+                            <w:rFonts w:ascii="Cambria Math" w:eastAsiaTheme="minorEastAsia" w:hAnsi="Cambria Math"/>
+                          </w:rPr>
+                          <m:t>M</m:t>
+                        </m:r>
+                      </m:e>
+                      <m:sub>
+                        <m:r>
+                          <w:rPr>
+                            <w:rFonts w:ascii="Cambria Math" w:eastAsiaTheme="minorEastAsia" w:hAnsi="Cambria Math"/>
+                          </w:rPr>
+                          <m:t>eff</m:t>
+                        </m:r>
+                      </m:sub>
+                    </m:sSub>
+                  </m:e>
+                  <m:e>
+                    <m:sSub>
+                      <m:sSubPr>
+                        <m:ctrlPr>
+                          <w:rPr>
+                            <w:rFonts w:ascii="Cambria Math" w:eastAsiaTheme="minorEastAsia" w:hAnsi="Cambria Math"/>
+                            <w:i/>
+                          </w:rPr>
+                        </m:ctrlPr>
+                      </m:sSubPr>
+                      <m:e>
+                        <m:r>
+                          <w:rPr>
+                            <w:rFonts w:ascii="Cambria Math" w:eastAsiaTheme="minorEastAsia" w:hAnsi="Cambria Math"/>
+                          </w:rPr>
+                          <m:t>m</m:t>
+                        </m:r>
+                      </m:e>
+                      <m:sub>
+                        <m:r>
+                          <w:rPr>
+                            <w:rFonts w:ascii="Cambria Math" w:eastAsiaTheme="minorEastAsia" w:hAnsi="Cambria Math"/>
+                          </w:rPr>
+                          <m:t>b</m:t>
+                        </m:r>
+                      </m:sub>
+                    </m:sSub>
+                    <m:r>
+                      <w:rPr>
+                        <w:rFonts w:ascii="Cambria Math" w:eastAsiaTheme="minorEastAsia" w:hAnsi="Cambria Math"/>
+                      </w:rPr>
+                      <m:t>l</m:t>
+                    </m:r>
+                    <m:func>
+                      <m:funcPr>
+                        <m:ctrlPr>
+                          <w:rPr>
+                            <w:rFonts w:ascii="Cambria Math" w:eastAsiaTheme="minorEastAsia" w:hAnsi="Cambria Math"/>
+                            <w:i/>
+                          </w:rPr>
+                        </m:ctrlPr>
+                      </m:funcPr>
+                      <m:fName>
+                        <m:r>
+                          <m:rPr>
+                            <m:sty m:val="p"/>
+                          </m:rPr>
+                          <w:rPr>
+                            <w:rFonts w:ascii="Cambria Math" w:hAnsi="Cambria Math"/>
+                          </w:rPr>
+                          <m:t>cos</m:t>
+                        </m:r>
+                      </m:fName>
+                      <m:e>
+                        <m:r>
+                          <w:rPr>
+                            <w:rFonts w:ascii="Cambria Math" w:eastAsiaTheme="minorEastAsia" w:hAnsi="Cambria Math"/>
+                          </w:rPr>
+                          <m:t>θ</m:t>
+                        </m:r>
+                      </m:e>
+                    </m:func>
+                  </m:e>
+                </m:mr>
+                <m:mr>
+                  <m:e>
+                    <m:sSub>
+                      <m:sSubPr>
+                        <m:ctrlPr>
+                          <w:rPr>
+                            <w:rFonts w:ascii="Cambria Math" w:eastAsiaTheme="minorEastAsia" w:hAnsi="Cambria Math"/>
+                            <w:i/>
+                          </w:rPr>
+                        </m:ctrlPr>
+                      </m:sSubPr>
+                      <m:e>
+                        <m:r>
+                          <w:rPr>
+                            <w:rFonts w:ascii="Cambria Math" w:eastAsiaTheme="minorEastAsia" w:hAnsi="Cambria Math"/>
+                          </w:rPr>
+                          <m:t>m</m:t>
+                        </m:r>
+                      </m:e>
+                      <m:sub>
+                        <m:r>
+                          <w:rPr>
+                            <w:rFonts w:ascii="Cambria Math" w:eastAsiaTheme="minorEastAsia" w:hAnsi="Cambria Math"/>
+                          </w:rPr>
+                          <m:t>b</m:t>
+                        </m:r>
+                      </m:sub>
+                    </m:sSub>
+                    <m:r>
+                      <w:rPr>
+                        <w:rFonts w:ascii="Cambria Math" w:eastAsiaTheme="minorEastAsia" w:hAnsi="Cambria Math"/>
+                      </w:rPr>
+                      <m:t>l</m:t>
+                    </m:r>
+                    <m:func>
+                      <m:funcPr>
+                        <m:ctrlPr>
+                          <w:rPr>
+                            <w:rFonts w:ascii="Cambria Math" w:eastAsiaTheme="minorEastAsia" w:hAnsi="Cambria Math"/>
+                            <w:i/>
+                          </w:rPr>
+                        </m:ctrlPr>
+                      </m:funcPr>
+                      <m:fName>
+                        <m:r>
+                          <m:rPr>
+                            <m:sty m:val="p"/>
+                          </m:rPr>
+                          <w:rPr>
+                            <w:rFonts w:ascii="Cambria Math" w:hAnsi="Cambria Math"/>
+                          </w:rPr>
+                          <m:t>cos</m:t>
+                        </m:r>
+                      </m:fName>
+                      <m:e>
+                        <m:r>
+                          <w:rPr>
+                            <w:rFonts w:ascii="Cambria Math" w:eastAsiaTheme="minorEastAsia" w:hAnsi="Cambria Math"/>
+                          </w:rPr>
+                          <m:t>θ</m:t>
+                        </m:r>
+                      </m:e>
+                    </m:func>
+                  </m:e>
+                  <m:e>
+                    <m:sSub>
+                      <m:sSubPr>
+                        <m:ctrlPr>
+                          <w:rPr>
+                            <w:rFonts w:ascii="Cambria Math" w:eastAsiaTheme="minorEastAsia" w:hAnsi="Cambria Math"/>
+                            <w:i/>
+                          </w:rPr>
+                        </m:ctrlPr>
+                      </m:sSubPr>
+                      <m:e>
+                        <m:r>
+                          <w:rPr>
+                            <w:rFonts w:ascii="Cambria Math" w:eastAsiaTheme="minorEastAsia" w:hAnsi="Cambria Math"/>
+                          </w:rPr>
+                          <m:t>I</m:t>
+                        </m:r>
+                      </m:e>
+                      <m:sub>
+                        <m:r>
+                          <w:rPr>
+                            <w:rFonts w:ascii="Cambria Math" w:eastAsiaTheme="minorEastAsia" w:hAnsi="Cambria Math"/>
+                          </w:rPr>
+                          <m:t>eff</m:t>
+                        </m:r>
+                      </m:sub>
+                    </m:sSub>
+                  </m:e>
+                </m:mr>
+              </m:m>
+            </m:e>
+          </m:d>
+        </m:oMath>
+      </m:oMathPara>
+    </w:p>
+    <w:p>
+      <w:pPr>
+        <w:jc w:val="center"/>
+        <w:rPr>
+          <w:rFonts w:eastAsiaTheme="minorEastAsia"/>
+        </w:rPr>
+      </w:pPr>
+    </w:p>
+    <w:p>
+      <w:pPr>
+        <w:jc w:val="center"/>
+        <w:rPr>
+          <w:rFonts w:eastAsiaTheme="minorEastAsia"/>
+        </w:rPr>
+      </w:pPr>
+      <m:oMathPara>
+        <m:oMath>
+          <m:r>
+            <w:rPr>
+              <w:rFonts w:ascii="Cambria Math" w:eastAsiaTheme="minorEastAsia" w:hAnsi="Cambria Math"/>
+            </w:rPr>
+            <m:t xml:space="preserve">C= </m:t>
+          </m:r>
+          <m:d>
+            <m:dPr>
+              <m:begChr m:val="["/>
+              <m:endChr m:val="]"/>
+              <m:ctrlPr>
+                <w:rPr>
+                  <w:rFonts w:ascii="Cambria Math" w:eastAsiaTheme="minorEastAsia" w:hAnsi="Cambria Math"/>
+                  <w:i/>
+                </w:rPr>
+              </m:ctrlPr>
+            </m:dPr>
+            <m:e>
+              <m:m>
+                <m:mPr>
+                  <m:mcs>
+                    <m:mc>
+                      <m:mcPr>
+                        <m:count m:val="1"/>
+                        <m:mcJc m:val="center"/>
+                      </m:mcPr>
+                    </m:mc>
+                  </m:mcs>
+                  <m:ctrlPr>
+                    <w:rPr>
+                      <w:rFonts w:ascii="Cambria Math" w:eastAsiaTheme="minorEastAsia" w:hAnsi="Cambria Math"/>
+                      <w:i/>
+                    </w:rPr>
+                  </m:ctrlPr>
+                </m:mPr>
+                <m:mr>
+                  <m:e>
+                    <m:r>
+                      <w:rPr>
+                        <w:rFonts w:ascii="Cambria Math" w:eastAsiaTheme="minorEastAsia" w:hAnsi="Cambria Math"/>
+                      </w:rPr>
+                      <m:t>-</m:t>
+                    </m:r>
+                    <m:sSub>
+                      <m:sSubPr>
+                        <m:ctrlPr>
+                          <w:rPr>
+                            <w:rFonts w:ascii="Cambria Math" w:eastAsiaTheme="minorEastAsia" w:hAnsi="Cambria Math"/>
+                            <w:i/>
+                          </w:rPr>
+                        </m:ctrlPr>
+                      </m:sSubPr>
+                      <m:e>
+                        <m:r>
+                          <w:rPr>
+                            <w:rFonts w:ascii="Cambria Math" w:eastAsiaTheme="minorEastAsia" w:hAnsi="Cambria Math"/>
+                          </w:rPr>
+                          <m:t>m</m:t>
+                        </m:r>
+                      </m:e>
+                      <m:sub>
+                        <m:r>
+                          <w:rPr>
+                            <w:rFonts w:ascii="Cambria Math" w:eastAsiaTheme="minorEastAsia" w:hAnsi="Cambria Math"/>
+                          </w:rPr>
+                          <m:t>b</m:t>
+                        </m:r>
+                      </m:sub>
+                    </m:sSub>
+                    <m:r>
+                      <w:rPr>
+                        <w:rFonts w:ascii="Cambria Math" w:eastAsiaTheme="minorEastAsia" w:hAnsi="Cambria Math"/>
+                      </w:rPr>
+                      <m:t>l</m:t>
+                    </m:r>
+                    <m:func>
+                      <m:funcPr>
+                        <m:ctrlPr>
+                          <w:rPr>
+                            <w:rFonts w:ascii="Cambria Math" w:eastAsiaTheme="minorEastAsia" w:hAnsi="Cambria Math"/>
+                            <w:i/>
+                          </w:rPr>
+                        </m:ctrlPr>
+                      </m:funcPr>
+                      <m:fName>
+                        <m:r>
+                          <m:rPr>
+                            <m:sty m:val="p"/>
+                          </m:rPr>
+                          <w:rPr>
+                            <w:rFonts w:ascii="Cambria Math" w:hAnsi="Cambria Math"/>
+                          </w:rPr>
+                          <m:t>sin</m:t>
+                        </m:r>
+                      </m:fName>
+                      <m:e>
+                        <m:r>
+                          <w:rPr>
+                            <w:rFonts w:ascii="Cambria Math" w:eastAsiaTheme="minorEastAsia" w:hAnsi="Cambria Math"/>
+                          </w:rPr>
+                          <m:t>θ</m:t>
+                        </m:r>
+                      </m:e>
+                    </m:func>
+                    <m:sSup>
+                      <m:sSupPr>
+                        <m:ctrlPr>
+                          <w:rPr>
+                            <w:rFonts w:ascii="Cambria Math" w:eastAsiaTheme="minorEastAsia" w:hAnsi="Cambria Math"/>
+                            <w:i/>
+                          </w:rPr>
+                        </m:ctrlPr>
+                      </m:sSupPr>
+                      <m:e>
+                        <m:acc>
+                          <m:accPr>
+                            <m:chr m:val="̇"/>
+                            <m:ctrlPr>
+                              <w:rPr>
+                                <w:rFonts w:ascii="Cambria Math" w:eastAsiaTheme="minorEastAsia" w:hAnsi="Cambria Math"/>
+                                <w:i/>
+                              </w:rPr>
+                            </m:ctrlPr>
+                          </m:accPr>
+                          <m:e>
+                            <m:r>
+                              <w:rPr>
+                                <w:rFonts w:ascii="Cambria Math" w:eastAsiaTheme="minorEastAsia" w:hAnsi="Cambria Math"/>
+                              </w:rPr>
+                              <m:t>θ</m:t>
+                            </m:r>
+                          </m:e>
+                        </m:acc>
+                      </m:e>
+                      <m:sup>
+                        <m:r>
+                          <w:rPr>
+                            <w:rFonts w:ascii="Cambria Math" w:eastAsiaTheme="minorEastAsia" w:hAnsi="Cambria Math"/>
+                          </w:rPr>
+                          <m:t>2</m:t>
+                        </m:r>
+                      </m:sup>
+                    </m:sSup>
+                  </m:e>
+                </m:mr>
+                <m:mr>
+                  <m:e>
+                    <m:r>
+                      <w:rPr>
+                        <w:rFonts w:ascii="Cambria Math" w:eastAsiaTheme="minorEastAsia" w:hAnsi="Cambria Math"/>
+                      </w:rPr>
+                      <m:t>0</m:t>
+                    </m:r>
+                  </m:e>
+                </m:mr>
+              </m:m>
+            </m:e>
+          </m:d>
+        </m:oMath>
+      </m:oMathPara>
+    </w:p>
+    <w:p>
+      <w:pPr>
+        <w:jc w:val="center"/>
+        <w:rPr>
+          <w:rFonts w:eastAsiaTheme="minorEastAsia"/>
+        </w:rPr>
+      </w:pPr>
+    </w:p>
+    <w:p>
+      <w:pPr>
+        <w:jc w:val="center"/>
+        <w:rPr>
+          <w:rFonts w:eastAsiaTheme="minorEastAsia"/>
+        </w:rPr>
+      </w:pPr>
+      <m:oMathPara>
+        <m:oMath>
+          <m:r>
+            <w:rPr>
+              <w:rFonts w:ascii="Cambria Math" w:eastAsiaTheme="minorEastAsia" w:hAnsi="Cambria Math"/>
+            </w:rPr>
+            <m:t xml:space="preserve">G= </m:t>
+          </m:r>
+          <m:d>
+            <m:dPr>
+              <m:begChr m:val="["/>
+              <m:endChr m:val="]"/>
+              <m:ctrlPr>
+                <w:rPr>
+                  <w:rFonts w:ascii="Cambria Math" w:eastAsiaTheme="minorEastAsia" w:hAnsi="Cambria Math"/>
+                  <w:i/>
+                </w:rPr>
+              </m:ctrlPr>
+            </m:dPr>
+            <m:e>
+              <m:m>
+                <m:mPr>
+                  <m:mcs>
+                    <m:mc>
+                      <m:mcPr>
+                        <m:count m:val="1"/>
+                        <m:mcJc m:val="center"/>
+                      </m:mcPr>
+                    </m:mc>
+                  </m:mcs>
+                  <m:ctrlPr>
+                    <w:rPr>
+                      <w:rFonts w:ascii="Cambria Math" w:eastAsiaTheme="minorEastAsia" w:hAnsi="Cambria Math"/>
+                      <w:i/>
+                    </w:rPr>
+                  </m:ctrlPr>
+                </m:mPr>
+                <m:mr>
+                  <m:e>
+                    <m:r>
+                      <w:rPr>
+                        <w:rFonts w:ascii="Cambria Math" w:eastAsiaTheme="minorEastAsia" w:hAnsi="Cambria Math"/>
+                      </w:rPr>
+                      <m:t>0</m:t>
+                    </m:r>
+                  </m:e>
+                </m:mr>
+                <m:mr>
+                  <m:e>
+                    <m:r>
+                      <w:rPr>
+                        <w:rFonts w:ascii="Cambria Math" w:eastAsiaTheme="minorEastAsia" w:hAnsi="Cambria Math"/>
+                      </w:rPr>
+                      <m:t>-</m:t>
+                    </m:r>
+                    <m:sSub>
+                      <m:sSubPr>
+                        <m:ctrlPr>
+                          <w:rPr>
+                            <w:rFonts w:ascii="Cambria Math" w:eastAsiaTheme="minorEastAsia" w:hAnsi="Cambria Math"/>
+                            <w:bCs/>
+                            <w:i/>
+                          </w:rPr>
+                        </m:ctrlPr>
+                      </m:sSubPr>
+                      <m:e>
+                        <m:r>
+                          <w:rPr>
+                            <w:rFonts w:ascii="Cambria Math" w:eastAsiaTheme="minorEastAsia" w:hAnsi="Cambria Math"/>
+                          </w:rPr>
+                          <m:t>m</m:t>
+                        </m:r>
+                      </m:e>
+                      <m:sub>
+                        <m:r>
+                          <w:rPr>
+                            <w:rFonts w:ascii="Cambria Math" w:eastAsiaTheme="minorEastAsia" w:hAnsi="Cambria Math"/>
+                          </w:rPr>
+                          <m:t>b</m:t>
+                        </m:r>
+                      </m:sub>
+                    </m:sSub>
+                    <m:r>
+                      <w:rPr>
+                        <w:rFonts w:ascii="Cambria Math" w:eastAsiaTheme="minorEastAsia" w:hAnsi="Cambria Math"/>
+                      </w:rPr>
+                      <m:t>gl</m:t>
+                    </m:r>
+                    <m:func>
+                      <m:funcPr>
+                        <m:ctrlPr>
+                          <w:rPr>
+                            <w:rFonts w:ascii="Cambria Math" w:eastAsiaTheme="minorEastAsia" w:hAnsi="Cambria Math"/>
+                            <w:bCs/>
+                            <w:i/>
+                          </w:rPr>
+                        </m:ctrlPr>
+                      </m:funcPr>
+                      <m:fName>
+                        <m:r>
+                          <m:rPr>
+                            <m:sty m:val="p"/>
+                          </m:rPr>
+                          <w:rPr>
+                            <w:rFonts w:ascii="Cambria Math" w:hAnsi="Cambria Math"/>
+                          </w:rPr>
+                          <m:t>sin</m:t>
+                        </m:r>
+                      </m:fName>
+                      <m:e>
+                        <m:r>
+                          <w:rPr>
+                            <w:rFonts w:ascii="Cambria Math" w:eastAsiaTheme="minorEastAsia" w:hAnsi="Cambria Math"/>
+                          </w:rPr>
+                          <m:t>θ</m:t>
+                        </m:r>
+                      </m:e>
+                    </m:func>
+                  </m:e>
+                </m:mr>
+              </m:m>
+            </m:e>
+          </m:d>
+        </m:oMath>
+      </m:oMathPara>
+    </w:p>
+    <w:p>
+      <w:pPr>
+        <w:jc w:val="center"/>
+        <w:rPr>
+          <w:rFonts w:eastAsiaTheme="minorEastAsia"/>
+        </w:rPr>
+      </w:pPr>
+    </w:p>
+    <w:p>
+      <w:pPr>
+        <w:jc w:val="center"/>
+        <w:rPr>
+          <w:rFonts w:eastAsiaTheme="minorEastAsia"/>
+        </w:rPr>
+      </w:pPr>
+      <m:oMathPara>
+        <m:oMath>
+          <m:r>
+            <w:rPr>
+              <w:rFonts w:ascii="Cambria Math" w:eastAsiaTheme="minorEastAsia" w:hAnsi="Cambria Math"/>
+            </w:rPr>
+            <m:t>B=</m:t>
+          </m:r>
+          <m:d>
+            <m:dPr>
+              <m:begChr m:val="["/>
+              <m:endChr m:val="]"/>
+              <m:ctrlPr>
+                <w:rPr>
+                  <w:rFonts w:ascii="Cambria Math" w:eastAsiaTheme="minorEastAsia" w:hAnsi="Cambria Math"/>
+                  <w:i/>
+                </w:rPr>
+              </m:ctrlPr>
+            </m:dPr>
+            <m:e>
+              <m:m>
+                <m:mPr>
+                  <m:mcs>
+                    <m:mc>
+                      <m:mcPr>
+                        <m:count m:val="1"/>
+                        <m:mcJc m:val="center"/>
+                      </m:mcPr>
+                    </m:mc>
+                  </m:mcs>
+                  <m:ctrlPr>
+                    <w:rPr>
+                      <w:rFonts w:ascii="Cambria Math" w:eastAsiaTheme="minorEastAsia" w:hAnsi="Cambria Math"/>
+                      <w:i/>
+                    </w:rPr>
+                  </m:ctrlPr>
+                </m:mPr>
+                <m:mr>
+                  <m:e>
+                    <m:r>
+                      <w:rPr>
+                        <w:rFonts w:ascii="Cambria Math" w:eastAsiaTheme="minorEastAsia" w:hAnsi="Cambria Math"/>
+                      </w:rPr>
+                      <m:t>1</m:t>
+                    </m:r>
+                  </m:e>
+                </m:mr>
+                <m:mr>
+                  <m:e>
+                    <m:r>
+                      <w:rPr>
+                        <w:rFonts w:ascii="Cambria Math" w:eastAsiaTheme="minorEastAsia" w:hAnsi="Cambria Math"/>
+                      </w:rPr>
+                      <m:t>0</m:t>
+                    </m:r>
+                  </m:e>
+                </m:mr>
+              </m:m>
+            </m:e>
+          </m:d>
+          <m:sSub>
+            <m:sSubPr>
+              <m:ctrlPr>
+                <w:rPr>
+                  <w:rFonts w:ascii="Cambria Math" w:eastAsiaTheme="minorEastAsia" w:hAnsi="Cambria Math"/>
+                  <w:i/>
+                </w:rPr>
+              </m:ctrlPr>
+            </m:sSubPr>
+            <m:e>
+              <m:r>
+                <w:rPr>
+                  <w:rFonts w:ascii="Cambria Math" w:eastAsiaTheme="minorEastAsia" w:hAnsi="Cambria Math"/>
+                </w:rPr>
+                <m:t>τ</m:t>
+              </m:r>
+            </m:e>
+            <m:sub>
+              <m:r>
+                <w:rPr>
+                  <w:rFonts w:ascii="Cambria Math" w:eastAsiaTheme="minorEastAsia" w:hAnsi="Cambria Math"/>
+                </w:rPr>
+                <m:t>m</m:t>
+              </m:r>
+            </m:sub>
+          </m:sSub>
+        </m:oMath>
+      </m:oMathPara>
+    </w:p>
+    <w:p>
+      <w:pPr>
+        <w:jc w:val="center"/>
+        <w:rPr>
+          <w:rFonts w:eastAsiaTheme="minorEastAsia"/>
+        </w:rPr>
+      </w:pPr>
+    </w:p>
+    <w:p>
+      <w:pPr>
+        <w:jc w:val="center"/>
+        <w:rPr>
+          <w:rFonts w:eastAsiaTheme="minorEastAsia"/>
+        </w:rPr>
+      </w:pPr>
+    </w:p>
+    <w:p>
+      <w:pPr>
+        <w:jc w:val="center"/>
+        <w:rPr>
+          <w:rFonts w:eastAsiaTheme="minorEastAsia"/>
+        </w:rPr>
+      </w:pPr>
     </w:p>
     <w:sectPr>
       <w:pgSz w:w="12240" w:h="15840"/>

</xml_diff>